<commit_message>
Add authentication endpoints to API plan
</commit_message>
<xml_diff>
--- a/docs/RaceDay_API_Endpoint_Plan.docx
+++ b/docs/RaceDay_API_Endpoint_Plan.docx
@@ -142,47 +142,47 @@
         <w:tblLook w:val="04A0" w:firstRow="1" w:lastRow="0" w:firstColumn="1" w:lastColumn="0" w:noHBand="0" w:noVBand="1"/>
       </w:tblPr>
       <w:tblGrid>
+        <w:gridCol w:w="1667"/>
+        <w:gridCol w:w="1992"/>
         <w:gridCol w:w="1696"/>
-        <w:gridCol w:w="1701"/>
-        <w:gridCol w:w="1701"/>
-        <w:gridCol w:w="2835"/>
-        <w:gridCol w:w="2835"/>
-        <w:gridCol w:w="3119"/>
+        <w:gridCol w:w="2753"/>
+        <w:gridCol w:w="2817"/>
+        <w:gridCol w:w="3023"/>
       </w:tblGrid>
       <w:tr>
         <w:tc>
           <w:tcPr>
+            <w:tcW w:w="1667" w:type="dxa"/>
+          </w:tcPr>
+          <w:p>
+            <w:r>
+              <w:t>HTTP METHOD</w:t>
+            </w:r>
+          </w:p>
+        </w:tc>
+        <w:tc>
+          <w:tcPr>
+            <w:tcW w:w="1992" w:type="dxa"/>
+          </w:tcPr>
+          <w:p>
+            <w:r>
+              <w:t>ROUTE</w:t>
+            </w:r>
+          </w:p>
+        </w:tc>
+        <w:tc>
+          <w:tcPr>
             <w:tcW w:w="1696" w:type="dxa"/>
           </w:tcPr>
           <w:p>
             <w:r>
-              <w:t>HTTP METHOD</w:t>
-            </w:r>
-          </w:p>
-        </w:tc>
-        <w:tc>
-          <w:tcPr>
-            <w:tcW w:w="1701" w:type="dxa"/>
-          </w:tcPr>
-          <w:p>
-            <w:r>
-              <w:t>ROUTE</w:t>
-            </w:r>
-          </w:p>
-        </w:tc>
-        <w:tc>
-          <w:tcPr>
-            <w:tcW w:w="1701" w:type="dxa"/>
-          </w:tcPr>
-          <w:p>
-            <w:r>
               <w:t>DESCRPTION</w:t>
             </w:r>
           </w:p>
         </w:tc>
         <w:tc>
           <w:tcPr>
-            <w:tcW w:w="2835" w:type="dxa"/>
+            <w:tcW w:w="2753" w:type="dxa"/>
           </w:tcPr>
           <w:p>
             <w:r>
@@ -192,7 +192,7 @@
         </w:tc>
         <w:tc>
           <w:tcPr>
-            <w:tcW w:w="2835" w:type="dxa"/>
+            <w:tcW w:w="2817" w:type="dxa"/>
           </w:tcPr>
           <w:p>
             <w:r>
@@ -202,7 +202,7 @@
         </w:tc>
         <w:tc>
           <w:tcPr>
-            <w:tcW w:w="3119" w:type="dxa"/>
+            <w:tcW w:w="3023" w:type="dxa"/>
           </w:tcPr>
           <w:p>
             <w:r>
@@ -214,7 +214,7 @@
       <w:tr>
         <w:tc>
           <w:tcPr>
-            <w:tcW w:w="13887" w:type="dxa"/>
+            <w:tcW w:w="13948" w:type="dxa"/>
             <w:gridSpan w:val="6"/>
           </w:tcPr>
           <w:p>
@@ -230,39 +230,131 @@
       <w:tr>
         <w:tc>
           <w:tcPr>
+            <w:tcW w:w="1667" w:type="dxa"/>
+          </w:tcPr>
+          <w:p>
+            <w:r>
+              <w:t>POST</w:t>
+            </w:r>
+          </w:p>
+        </w:tc>
+        <w:tc>
+          <w:tcPr>
+            <w:tcW w:w="1992" w:type="dxa"/>
+          </w:tcPr>
+          <w:p>
+            <w:r>
+              <w:t>/api/auth/register</w:t>
+            </w:r>
+          </w:p>
+        </w:tc>
+        <w:tc>
+          <w:tcPr>
             <w:tcW w:w="1696" w:type="dxa"/>
           </w:tcPr>
-          <w:p/>
-        </w:tc>
-        <w:tc>
-          <w:tcPr>
-            <w:tcW w:w="1701" w:type="dxa"/>
-          </w:tcPr>
-          <w:p/>
-        </w:tc>
-        <w:tc>
-          <w:tcPr>
-            <w:tcW w:w="1701" w:type="dxa"/>
-          </w:tcPr>
-          <w:p/>
-        </w:tc>
-        <w:tc>
-          <w:tcPr>
-            <w:tcW w:w="2835" w:type="dxa"/>
-          </w:tcPr>
-          <w:p/>
-        </w:tc>
-        <w:tc>
-          <w:tcPr>
-            <w:tcW w:w="2835" w:type="dxa"/>
-          </w:tcPr>
-          <w:p/>
-        </w:tc>
-        <w:tc>
-          <w:tcPr>
-            <w:tcW w:w="3119" w:type="dxa"/>
-          </w:tcPr>
-          <w:p/>
+          <w:p>
+            <w:r>
+              <w:t>Registers a new account with a selected role (Participant or Organiser).</w:t>
+            </w:r>
+          </w:p>
+        </w:tc>
+        <w:tc>
+          <w:tcPr>
+            <w:tcW w:w="2753" w:type="dxa"/>
+          </w:tcPr>
+          <w:p/>
+          <w:p/>
+          <w:p/>
+          <w:p>
+            <w:pPr>
+              <w:jc w:val="center"/>
+            </w:pPr>
+            <w:r>
+              <w:t>Public</w:t>
+            </w:r>
+          </w:p>
+        </w:tc>
+        <w:tc>
+          <w:tcPr>
+            <w:tcW w:w="2817" w:type="dxa"/>
+          </w:tcPr>
+          <w:p>
+            <w:r>
+              <w:t>{ "email": "user@example.com", "password": "SecretPassword123", "firstName": "John", "lastName": "Doe", "roleID": 1 }</w:t>
+            </w:r>
+          </w:p>
+        </w:tc>
+        <w:tc>
+          <w:tcPr>
+            <w:tcW w:w="3023" w:type="dxa"/>
+          </w:tcPr>
+          <w:p>
+            <w:r>
+              <w:t>201 Created (User Object + Token); 400 Bad Request; 409 Conflict</w:t>
+            </w:r>
+          </w:p>
+        </w:tc>
+      </w:tr>
+      <w:tr>
+        <w:tc>
+          <w:tcPr>
+            <w:tcW w:w="1667" w:type="dxa"/>
+          </w:tcPr>
+          <w:p>
+            <w:r>
+              <w:t xml:space="preserve">POST </w:t>
+            </w:r>
+          </w:p>
+        </w:tc>
+        <w:tc>
+          <w:tcPr>
+            <w:tcW w:w="1992" w:type="dxa"/>
+          </w:tcPr>
+          <w:p>
+            <w:r>
+              <w:t>/api/auth/login</w:t>
+            </w:r>
+          </w:p>
+        </w:tc>
+        <w:tc>
+          <w:tcPr>
+            <w:tcW w:w="1696" w:type="dxa"/>
+          </w:tcPr>
+          <w:p>
+            <w:r>
+              <w:t>Authenticates a user and issues a JWT token.</w:t>
+            </w:r>
+          </w:p>
+        </w:tc>
+        <w:tc>
+          <w:tcPr>
+            <w:tcW w:w="2753" w:type="dxa"/>
+          </w:tcPr>
+          <w:p>
+            <w:r>
+              <w:t>Public</w:t>
+            </w:r>
+          </w:p>
+        </w:tc>
+        <w:tc>
+          <w:tcPr>
+            <w:tcW w:w="2817" w:type="dxa"/>
+          </w:tcPr>
+          <w:p>
+            <w:r>
+              <w:t>{ "email": "user@example.com", "password": "SecretPassword123" }</w:t>
+            </w:r>
+          </w:p>
+        </w:tc>
+        <w:tc>
+          <w:tcPr>
+            <w:tcW w:w="3023" w:type="dxa"/>
+          </w:tcPr>
+          <w:p>
+            <w:r>
+              <w:t>200 OK (Auth Token + User Profile); 401 Unauthorized</w:t>
+            </w:r>
+          </w:p>
         </w:tc>
       </w:tr>
     </w:tbl>
@@ -417,6 +509,7 @@
           </w:tcPr>
           <w:p>
             <w:r>
+              <w:lastRenderedPageBreak/>
               <w:t>HTTP METHOD</w:t>
             </w:r>
           </w:p>
@@ -678,7 +771,6 @@
           </w:tcPr>
           <w:p>
             <w:r>
-              <w:lastRenderedPageBreak/>
               <w:t>HTTP METHOD</w:t>
             </w:r>
           </w:p>

</xml_diff>

<commit_message>
Add User Profile endpoints to the API  plan
</commit_message>
<xml_diff>
--- a/docs/RaceDay_API_Endpoint_Plan.docx
+++ b/docs/RaceDay_API_Endpoint_Plan.docx
@@ -2,138 +2,6 @@
 <file path=word/document.xml><?xml version="1.0" encoding="utf-8"?>
 <w:document xmlns:wpc="http://schemas.microsoft.com/office/word/2010/wordprocessingCanvas" xmlns:cx="http://schemas.microsoft.com/office/drawing/2014/chartex" xmlns:cx1="http://schemas.microsoft.com/office/drawing/2015/9/8/chartex" xmlns:cx2="http://schemas.microsoft.com/office/drawing/2015/10/21/chartex" xmlns:cx3="http://schemas.microsoft.com/office/drawing/2016/5/9/chartex" xmlns:cx4="http://schemas.microsoft.com/office/drawing/2016/5/10/chartex" xmlns:cx5="http://schemas.microsoft.com/office/drawing/2016/5/11/chartex" xmlns:cx6="http://schemas.microsoft.com/office/drawing/2016/5/12/chartex" xmlns:cx7="http://schemas.microsoft.com/office/drawing/2016/5/13/chartex" xmlns:cx8="http://schemas.microsoft.com/office/drawing/2016/5/14/chartex" xmlns:mc="http://schemas.openxmlformats.org/markup-compatibility/2006" xmlns:aink="http://schemas.microsoft.com/office/drawing/2016/ink" xmlns:am3d="http://schemas.microsoft.com/office/drawing/2017/model3d" xmlns:o="urn:schemas-microsoft-com:office:office" xmlns:oel="http://schemas.microsoft.com/office/2019/extlst" xmlns:r="http://schemas.openxmlformats.org/officeDocument/2006/relationships" xmlns:m="http://schemas.openxmlformats.org/officeDocument/2006/math" xmlns:v="urn:schemas-microsoft-com:vml" xmlns:wp14="http://schemas.microsoft.com/office/word/2010/wordprocessingDrawing" xmlns:wp="http://schemas.openxmlformats.org/drawingml/2006/wordprocessingDrawing" xmlns:w10="urn:schemas-microsoft-com:office:word" xmlns:w="http://schemas.openxmlformats.org/wordprocessingml/2006/main" xmlns:w14="http://schemas.microsoft.com/office/word/2010/wordml" xmlns:w15="http://schemas.microsoft.com/office/word/2012/wordml" xmlns:w16cex="http://schemas.microsoft.com/office/word/2018/wordml/cex" xmlns:w16cid="http://schemas.microsoft.com/office/word/2016/wordml/cid" xmlns:w16="http://schemas.microsoft.com/office/word/2018/wordml" xmlns:w16du="http://schemas.microsoft.com/office/word/2023/wordml/word16du" xmlns:w16sdtdh="http://schemas.microsoft.com/office/word/2020/wordml/sdtdatahash" xmlns:w16sdtfl="http://schemas.microsoft.com/office/word/2024/wordml/sdtformatlock" xmlns:w16se="http://schemas.microsoft.com/office/word/2015/wordml/symex" xmlns:wpg="http://schemas.microsoft.com/office/word/2010/wordprocessingGroup" xmlns:wpi="http://schemas.microsoft.com/office/word/2010/wordprocessingInk" xmlns:wne="http://schemas.microsoft.com/office/word/2006/wordml" xmlns:wps="http://schemas.microsoft.com/office/word/2010/wordprocessingShape" mc:Ignorable="w14 w15 w16se w16cid w16 w16cex w16sdtdh w16sdtfl w16du wp14">
   <w:body>
-    <w:tbl>
-      <w:tblPr>
-        <w:tblStyle w:val="TableGrid"/>
-        <w:tblW w:w="0" w:type="auto"/>
-        <w:tblLook w:val="04A0" w:firstRow="1" w:lastRow="0" w:firstColumn="1" w:lastColumn="0" w:noHBand="0" w:noVBand="1"/>
-      </w:tblPr>
-      <w:tblGrid>
-        <w:gridCol w:w="1696"/>
-        <w:gridCol w:w="1701"/>
-        <w:gridCol w:w="1701"/>
-        <w:gridCol w:w="2835"/>
-        <w:gridCol w:w="2835"/>
-        <w:gridCol w:w="3119"/>
-      </w:tblGrid>
-      <w:tr>
-        <w:tc>
-          <w:tcPr>
-            <w:tcW w:w="1696" w:type="dxa"/>
-          </w:tcPr>
-          <w:p>
-            <w:r>
-              <w:t>HTTP METHOD</w:t>
-            </w:r>
-          </w:p>
-        </w:tc>
-        <w:tc>
-          <w:tcPr>
-            <w:tcW w:w="1701" w:type="dxa"/>
-          </w:tcPr>
-          <w:p>
-            <w:r>
-              <w:t>ROUTE</w:t>
-            </w:r>
-          </w:p>
-        </w:tc>
-        <w:tc>
-          <w:tcPr>
-            <w:tcW w:w="1701" w:type="dxa"/>
-          </w:tcPr>
-          <w:p>
-            <w:r>
-              <w:t>DESCRPTION</w:t>
-            </w:r>
-          </w:p>
-        </w:tc>
-        <w:tc>
-          <w:tcPr>
-            <w:tcW w:w="2835" w:type="dxa"/>
-          </w:tcPr>
-          <w:p>
-            <w:r>
-              <w:t>ROLE REQUIRED</w:t>
-            </w:r>
-          </w:p>
-        </w:tc>
-        <w:tc>
-          <w:tcPr>
-            <w:tcW w:w="2835" w:type="dxa"/>
-          </w:tcPr>
-          <w:p>
-            <w:r>
-              <w:t>REQUEST BODY</w:t>
-            </w:r>
-          </w:p>
-        </w:tc>
-        <w:tc>
-          <w:tcPr>
-            <w:tcW w:w="3119" w:type="dxa"/>
-          </w:tcPr>
-          <w:p>
-            <w:r>
-              <w:t>EXPECTED RESPONSE</w:t>
-            </w:r>
-          </w:p>
-        </w:tc>
-      </w:tr>
-      <w:tr>
-        <w:tc>
-          <w:tcPr>
-            <w:tcW w:w="13887" w:type="dxa"/>
-            <w:gridSpan w:val="6"/>
-          </w:tcPr>
-          <w:p>
-            <w:r>
-              <w:t>A</w:t>
-            </w:r>
-            <w:r>
-              <w:t>uthentication</w:t>
-            </w:r>
-          </w:p>
-        </w:tc>
-      </w:tr>
-      <w:tr>
-        <w:tc>
-          <w:tcPr>
-            <w:tcW w:w="1696" w:type="dxa"/>
-          </w:tcPr>
-          <w:p/>
-        </w:tc>
-        <w:tc>
-          <w:tcPr>
-            <w:tcW w:w="1701" w:type="dxa"/>
-          </w:tcPr>
-          <w:p/>
-        </w:tc>
-        <w:tc>
-          <w:tcPr>
-            <w:tcW w:w="1701" w:type="dxa"/>
-          </w:tcPr>
-          <w:p/>
-        </w:tc>
-        <w:tc>
-          <w:tcPr>
-            <w:tcW w:w="2835" w:type="dxa"/>
-          </w:tcPr>
-          <w:p/>
-        </w:tc>
-        <w:tc>
-          <w:tcPr>
-            <w:tcW w:w="2835" w:type="dxa"/>
-          </w:tcPr>
-          <w:p/>
-        </w:tc>
-        <w:tc>
-          <w:tcPr>
-            <w:tcW w:w="3119" w:type="dxa"/>
-          </w:tcPr>
-          <w:p/>
-        </w:tc>
-      </w:tr>
-    </w:tbl>
-    <w:p/>
     <w:p/>
     <w:tbl>
       <w:tblPr>
@@ -219,10 +87,7 @@
           </w:tcPr>
           <w:p>
             <w:r>
-              <w:t>User</w:t>
-            </w:r>
-            <w:r>
-              <w:t xml:space="preserve"> Profile</w:t>
+              <w:t>Authentication</w:t>
             </w:r>
           </w:p>
         </w:tc>
@@ -279,9 +144,19 @@
             <w:tcW w:w="2817" w:type="dxa"/>
           </w:tcPr>
           <w:p>
-            <w:r>
-              <w:t>{ "email": "user@example.com", "password": "SecretPassword123", "firstName": "John", "lastName": "Doe", "roleID": 1 }</w:t>
-            </w:r>
+            <w:proofErr w:type="gramStart"/>
+            <w:r>
+              <w:t>{ "</w:t>
+            </w:r>
+            <w:proofErr w:type="gramEnd"/>
+            <w:r>
+              <w:t xml:space="preserve">email": "user@example.com", "password": "SecretPassword123", "firstName": "John", "lastName": "Doe", "roleID": </w:t>
+            </w:r>
+            <w:proofErr w:type="gramStart"/>
+            <w:r>
+              <w:t>1 }</w:t>
+            </w:r>
+            <w:proofErr w:type="gramEnd"/>
           </w:p>
         </w:tc>
         <w:tc>
@@ -341,9 +216,19 @@
             <w:tcW w:w="2817" w:type="dxa"/>
           </w:tcPr>
           <w:p>
-            <w:r>
-              <w:t>{ "email": "user@example.com", "password": "SecretPassword123" }</w:t>
-            </w:r>
+            <w:proofErr w:type="gramStart"/>
+            <w:r>
+              <w:t>{ "</w:t>
+            </w:r>
+            <w:proofErr w:type="gramEnd"/>
+            <w:r>
+              <w:t>email": "user@example.com", "password": "SecretPassword123</w:t>
+            </w:r>
+            <w:proofErr w:type="gramStart"/>
+            <w:r>
+              <w:t>" }</w:t>
+            </w:r>
+            <w:proofErr w:type="gramEnd"/>
           </w:p>
         </w:tc>
         <w:tc>
@@ -355,6 +240,351 @@
               <w:t>200 OK (Auth Token + User Profile); 401 Unauthorized</w:t>
             </w:r>
           </w:p>
+        </w:tc>
+      </w:tr>
+    </w:tbl>
+    <w:p/>
+    <w:tbl>
+      <w:tblPr>
+        <w:tblStyle w:val="TableGrid"/>
+        <w:tblW w:w="0" w:type="auto"/>
+        <w:tblLook w:val="04A0" w:firstRow="1" w:lastRow="0" w:firstColumn="1" w:lastColumn="0" w:noHBand="0" w:noVBand="1"/>
+      </w:tblPr>
+      <w:tblGrid>
+        <w:gridCol w:w="1655"/>
+        <w:gridCol w:w="1754"/>
+        <w:gridCol w:w="1695"/>
+        <w:gridCol w:w="2722"/>
+        <w:gridCol w:w="3117"/>
+        <w:gridCol w:w="3005"/>
+      </w:tblGrid>
+      <w:tr>
+        <w:tc>
+          <w:tcPr>
+            <w:tcW w:w="1696" w:type="dxa"/>
+          </w:tcPr>
+          <w:p>
+            <w:r>
+              <w:t>HTTP METHOD</w:t>
+            </w:r>
+          </w:p>
+        </w:tc>
+        <w:tc>
+          <w:tcPr>
+            <w:tcW w:w="1754" w:type="dxa"/>
+          </w:tcPr>
+          <w:p>
+            <w:r>
+              <w:t>ROUTE</w:t>
+            </w:r>
+          </w:p>
+        </w:tc>
+        <w:tc>
+          <w:tcPr>
+            <w:tcW w:w="1701" w:type="dxa"/>
+          </w:tcPr>
+          <w:p>
+            <w:r>
+              <w:t>DESCRPTION</w:t>
+            </w:r>
+          </w:p>
+        </w:tc>
+        <w:tc>
+          <w:tcPr>
+            <w:tcW w:w="2835" w:type="dxa"/>
+          </w:tcPr>
+          <w:p>
+            <w:r>
+              <w:t>ROLE REQUIRED</w:t>
+            </w:r>
+          </w:p>
+        </w:tc>
+        <w:tc>
+          <w:tcPr>
+            <w:tcW w:w="2835" w:type="dxa"/>
+          </w:tcPr>
+          <w:p>
+            <w:r>
+              <w:t>REQUEST BODY</w:t>
+            </w:r>
+          </w:p>
+        </w:tc>
+        <w:tc>
+          <w:tcPr>
+            <w:tcW w:w="3119" w:type="dxa"/>
+          </w:tcPr>
+          <w:p>
+            <w:r>
+              <w:t>EXPECTED RESPONSE</w:t>
+            </w:r>
+          </w:p>
+        </w:tc>
+      </w:tr>
+      <w:tr>
+        <w:tc>
+          <w:tcPr>
+            <w:tcW w:w="13940" w:type="dxa"/>
+            <w:gridSpan w:val="6"/>
+          </w:tcPr>
+          <w:p>
+            <w:r>
+              <w:t>User Profile</w:t>
+            </w:r>
+          </w:p>
+        </w:tc>
+      </w:tr>
+      <w:tr>
+        <w:tc>
+          <w:tcPr>
+            <w:tcW w:w="1696" w:type="dxa"/>
+          </w:tcPr>
+          <w:p>
+            <w:r>
+              <w:t>GET</w:t>
+            </w:r>
+          </w:p>
+        </w:tc>
+        <w:tc>
+          <w:tcPr>
+            <w:tcW w:w="1754" w:type="dxa"/>
+          </w:tcPr>
+          <w:p>
+            <w:r>
+              <w:t>/api/profile/me</w:t>
+            </w:r>
+          </w:p>
+        </w:tc>
+        <w:tc>
+          <w:tcPr>
+            <w:tcW w:w="1701" w:type="dxa"/>
+          </w:tcPr>
+          <w:p>
+            <w:r>
+              <w:t>Retrieves current logged-in user profile details.</w:t>
+            </w:r>
+          </w:p>
+        </w:tc>
+        <w:tc>
+          <w:tcPr>
+            <w:tcW w:w="2835" w:type="dxa"/>
+          </w:tcPr>
+          <w:p>
+            <w:r>
+              <w:t>Participant / Organiser</w:t>
+            </w:r>
+          </w:p>
+        </w:tc>
+        <w:tc>
+          <w:tcPr>
+            <w:tcW w:w="2835" w:type="dxa"/>
+          </w:tcPr>
+          <w:p>
+            <w:r>
+              <w:t>None</w:t>
+            </w:r>
+          </w:p>
+        </w:tc>
+        <w:tc>
+          <w:tcPr>
+            <w:tcW w:w="3119" w:type="dxa"/>
+          </w:tcPr>
+          <w:p>
+            <w:r>
+              <w:t>200 OK (User Profile Object); 401 Unauthorized</w:t>
+            </w:r>
+          </w:p>
+        </w:tc>
+      </w:tr>
+      <w:tr>
+        <w:tc>
+          <w:tcPr>
+            <w:tcW w:w="1696" w:type="dxa"/>
+          </w:tcPr>
+          <w:p>
+            <w:r>
+              <w:t>PUT</w:t>
+            </w:r>
+          </w:p>
+        </w:tc>
+        <w:tc>
+          <w:tcPr>
+            <w:tcW w:w="1754" w:type="dxa"/>
+          </w:tcPr>
+          <w:p>
+            <w:r>
+              <w:t>/api/profile/me</w:t>
+            </w:r>
+          </w:p>
+        </w:tc>
+        <w:tc>
+          <w:tcPr>
+            <w:tcW w:w="1701" w:type="dxa"/>
+          </w:tcPr>
+          <w:p>
+            <w:r>
+              <w:t>Updates user profile information (name, contact details).</w:t>
+            </w:r>
+          </w:p>
+        </w:tc>
+        <w:tc>
+          <w:tcPr>
+            <w:tcW w:w="2835" w:type="dxa"/>
+          </w:tcPr>
+          <w:p>
+            <w:r>
+              <w:t>Participant / Organiser</w:t>
+            </w:r>
+          </w:p>
+        </w:tc>
+        <w:tc>
+          <w:tcPr>
+            <w:tcW w:w="2835" w:type="dxa"/>
+          </w:tcPr>
+          <w:p>
+            <w:r>
+              <w:t>{ "firstName": "John", "lastName": "Smith", "email": "john.smith@example.com" }</w:t>
+            </w:r>
+          </w:p>
+        </w:tc>
+        <w:tc>
+          <w:tcPr>
+            <w:tcW w:w="3119" w:type="dxa"/>
+          </w:tcPr>
+          <w:p>
+            <w:r>
+              <w:t>200 OK; 400 Bad Request; 401 Unauthorized</w:t>
+            </w:r>
+          </w:p>
+        </w:tc>
+      </w:tr>
+    </w:tbl>
+    <w:p/>
+    <w:p/>
+    <w:tbl>
+      <w:tblPr>
+        <w:tblStyle w:val="TableGrid"/>
+        <w:tblW w:w="0" w:type="auto"/>
+        <w:tblLook w:val="04A0" w:firstRow="1" w:lastRow="0" w:firstColumn="1" w:lastColumn="0" w:noHBand="0" w:noVBand="1"/>
+      </w:tblPr>
+      <w:tblGrid>
+        <w:gridCol w:w="1696"/>
+        <w:gridCol w:w="1701"/>
+        <w:gridCol w:w="1701"/>
+        <w:gridCol w:w="2835"/>
+        <w:gridCol w:w="2835"/>
+        <w:gridCol w:w="3119"/>
+      </w:tblGrid>
+      <w:tr>
+        <w:tc>
+          <w:tcPr>
+            <w:tcW w:w="1696" w:type="dxa"/>
+          </w:tcPr>
+          <w:p>
+            <w:r>
+              <w:t>HTTP METHOD</w:t>
+            </w:r>
+          </w:p>
+        </w:tc>
+        <w:tc>
+          <w:tcPr>
+            <w:tcW w:w="1701" w:type="dxa"/>
+          </w:tcPr>
+          <w:p>
+            <w:r>
+              <w:t>ROUTE</w:t>
+            </w:r>
+          </w:p>
+        </w:tc>
+        <w:tc>
+          <w:tcPr>
+            <w:tcW w:w="1701" w:type="dxa"/>
+          </w:tcPr>
+          <w:p>
+            <w:r>
+              <w:t>DESCRPTION</w:t>
+            </w:r>
+          </w:p>
+        </w:tc>
+        <w:tc>
+          <w:tcPr>
+            <w:tcW w:w="2835" w:type="dxa"/>
+          </w:tcPr>
+          <w:p>
+            <w:r>
+              <w:t>ROLE REQUIRED</w:t>
+            </w:r>
+          </w:p>
+        </w:tc>
+        <w:tc>
+          <w:tcPr>
+            <w:tcW w:w="2835" w:type="dxa"/>
+          </w:tcPr>
+          <w:p>
+            <w:r>
+              <w:t>REQUEST BODY</w:t>
+            </w:r>
+          </w:p>
+        </w:tc>
+        <w:tc>
+          <w:tcPr>
+            <w:tcW w:w="3119" w:type="dxa"/>
+          </w:tcPr>
+          <w:p>
+            <w:r>
+              <w:t>EXPECTED RESPONSE</w:t>
+            </w:r>
+          </w:p>
+        </w:tc>
+      </w:tr>
+      <w:tr>
+        <w:tc>
+          <w:tcPr>
+            <w:tcW w:w="13887" w:type="dxa"/>
+            <w:gridSpan w:val="6"/>
+          </w:tcPr>
+          <w:p>
+            <w:r>
+              <w:t>Events</w:t>
+            </w:r>
+          </w:p>
+        </w:tc>
+      </w:tr>
+      <w:tr>
+        <w:tc>
+          <w:tcPr>
+            <w:tcW w:w="1696" w:type="dxa"/>
+          </w:tcPr>
+          <w:p/>
+        </w:tc>
+        <w:tc>
+          <w:tcPr>
+            <w:tcW w:w="1701" w:type="dxa"/>
+          </w:tcPr>
+          <w:p/>
+        </w:tc>
+        <w:tc>
+          <w:tcPr>
+            <w:tcW w:w="1701" w:type="dxa"/>
+          </w:tcPr>
+          <w:p/>
+        </w:tc>
+        <w:tc>
+          <w:tcPr>
+            <w:tcW w:w="2835" w:type="dxa"/>
+          </w:tcPr>
+          <w:p/>
+        </w:tc>
+        <w:tc>
+          <w:tcPr>
+            <w:tcW w:w="2835" w:type="dxa"/>
+          </w:tcPr>
+          <w:p/>
+        </w:tc>
+        <w:tc>
+          <w:tcPr>
+            <w:tcW w:w="3119" w:type="dxa"/>
+          </w:tcPr>
+          <w:p/>
         </w:tc>
       </w:tr>
     </w:tbl>
@@ -380,136 +610,6 @@
           </w:tcPr>
           <w:p>
             <w:r>
-              <w:t>HTTP METHOD</w:t>
-            </w:r>
-          </w:p>
-        </w:tc>
-        <w:tc>
-          <w:tcPr>
-            <w:tcW w:w="1701" w:type="dxa"/>
-          </w:tcPr>
-          <w:p>
-            <w:r>
-              <w:t>ROUTE</w:t>
-            </w:r>
-          </w:p>
-        </w:tc>
-        <w:tc>
-          <w:tcPr>
-            <w:tcW w:w="1701" w:type="dxa"/>
-          </w:tcPr>
-          <w:p>
-            <w:r>
-              <w:t>DESCRPTION</w:t>
-            </w:r>
-          </w:p>
-        </w:tc>
-        <w:tc>
-          <w:tcPr>
-            <w:tcW w:w="2835" w:type="dxa"/>
-          </w:tcPr>
-          <w:p>
-            <w:r>
-              <w:t>ROLE REQUIRED</w:t>
-            </w:r>
-          </w:p>
-        </w:tc>
-        <w:tc>
-          <w:tcPr>
-            <w:tcW w:w="2835" w:type="dxa"/>
-          </w:tcPr>
-          <w:p>
-            <w:r>
-              <w:t>REQUEST BODY</w:t>
-            </w:r>
-          </w:p>
-        </w:tc>
-        <w:tc>
-          <w:tcPr>
-            <w:tcW w:w="3119" w:type="dxa"/>
-          </w:tcPr>
-          <w:p>
-            <w:r>
-              <w:t>EXPECTED RESPONSE</w:t>
-            </w:r>
-          </w:p>
-        </w:tc>
-      </w:tr>
-      <w:tr>
-        <w:tc>
-          <w:tcPr>
-            <w:tcW w:w="13887" w:type="dxa"/>
-            <w:gridSpan w:val="6"/>
-          </w:tcPr>
-          <w:p>
-            <w:r>
-              <w:t>Events</w:t>
-            </w:r>
-          </w:p>
-        </w:tc>
-      </w:tr>
-      <w:tr>
-        <w:tc>
-          <w:tcPr>
-            <w:tcW w:w="1696" w:type="dxa"/>
-          </w:tcPr>
-          <w:p/>
-        </w:tc>
-        <w:tc>
-          <w:tcPr>
-            <w:tcW w:w="1701" w:type="dxa"/>
-          </w:tcPr>
-          <w:p/>
-        </w:tc>
-        <w:tc>
-          <w:tcPr>
-            <w:tcW w:w="1701" w:type="dxa"/>
-          </w:tcPr>
-          <w:p/>
-        </w:tc>
-        <w:tc>
-          <w:tcPr>
-            <w:tcW w:w="2835" w:type="dxa"/>
-          </w:tcPr>
-          <w:p/>
-        </w:tc>
-        <w:tc>
-          <w:tcPr>
-            <w:tcW w:w="2835" w:type="dxa"/>
-          </w:tcPr>
-          <w:p/>
-        </w:tc>
-        <w:tc>
-          <w:tcPr>
-            <w:tcW w:w="3119" w:type="dxa"/>
-          </w:tcPr>
-          <w:p/>
-        </w:tc>
-      </w:tr>
-    </w:tbl>
-    <w:p/>
-    <w:tbl>
-      <w:tblPr>
-        <w:tblStyle w:val="TableGrid"/>
-        <w:tblW w:w="0" w:type="auto"/>
-        <w:tblLook w:val="04A0" w:firstRow="1" w:lastRow="0" w:firstColumn="1" w:lastColumn="0" w:noHBand="0" w:noVBand="1"/>
-      </w:tblPr>
-      <w:tblGrid>
-        <w:gridCol w:w="1696"/>
-        <w:gridCol w:w="1701"/>
-        <w:gridCol w:w="1701"/>
-        <w:gridCol w:w="2835"/>
-        <w:gridCol w:w="2835"/>
-        <w:gridCol w:w="3119"/>
-      </w:tblGrid>
-      <w:tr>
-        <w:tc>
-          <w:tcPr>
-            <w:tcW w:w="1696" w:type="dxa"/>
-          </w:tcPr>
-          <w:p>
-            <w:r>
-              <w:lastRenderedPageBreak/>
               <w:t>HTTP METHOD</w:t>
             </w:r>
           </w:p>

</xml_diff>

<commit_message>
Add category endpoints to API plan
</commit_message>
<xml_diff>
--- a/docs/RaceDay_API_Endpoint_Plan.docx
+++ b/docs/RaceDay_API_Endpoint_Plan.docx
@@ -109,7 +109,15 @@
           </w:tcPr>
           <w:p>
             <w:r>
-              <w:t>/api/auth/register</w:t>
+              <w:t>/</w:t>
+            </w:r>
+            <w:proofErr w:type="spellStart"/>
+            <w:r>
+              <w:t>api</w:t>
+            </w:r>
+            <w:proofErr w:type="spellEnd"/>
+            <w:r>
+              <w:t>/auth/register</w:t>
             </w:r>
           </w:p>
         </w:tc>
@@ -144,9 +152,43 @@
             <w:tcW w:w="2817" w:type="dxa"/>
           </w:tcPr>
           <w:p>
-            <w:r>
-              <w:t>{ "email": "user@example.com", "password": "SecretPassword123", "firstName": "John", "lastName": "Doe", "roleID": 1 }</w:t>
-            </w:r>
+            <w:proofErr w:type="gramStart"/>
+            <w:r>
+              <w:t>{ "</w:t>
+            </w:r>
+            <w:proofErr w:type="gramEnd"/>
+            <w:r>
+              <w:t>email": "user@example.com", "password": "SecretPassword123", "</w:t>
+            </w:r>
+            <w:proofErr w:type="spellStart"/>
+            <w:r>
+              <w:t>firstName</w:t>
+            </w:r>
+            <w:proofErr w:type="spellEnd"/>
+            <w:r>
+              <w:t>": "John", "</w:t>
+            </w:r>
+            <w:proofErr w:type="spellStart"/>
+            <w:r>
+              <w:t>lastName</w:t>
+            </w:r>
+            <w:proofErr w:type="spellEnd"/>
+            <w:r>
+              <w:t>": "Doe", "</w:t>
+            </w:r>
+            <w:proofErr w:type="spellStart"/>
+            <w:r>
+              <w:t>roleID</w:t>
+            </w:r>
+            <w:proofErr w:type="spellEnd"/>
+            <w:r>
+              <w:t xml:space="preserve">": </w:t>
+            </w:r>
+            <w:proofErr w:type="gramStart"/>
+            <w:r>
+              <w:t>1 }</w:t>
+            </w:r>
+            <w:proofErr w:type="gramEnd"/>
           </w:p>
         </w:tc>
         <w:tc>
@@ -177,7 +219,15 @@
           </w:tcPr>
           <w:p>
             <w:r>
-              <w:t>/api/auth/login</w:t>
+              <w:t>/</w:t>
+            </w:r>
+            <w:proofErr w:type="spellStart"/>
+            <w:r>
+              <w:t>api</w:t>
+            </w:r>
+            <w:proofErr w:type="spellEnd"/>
+            <w:r>
+              <w:t>/auth/login</w:t>
             </w:r>
           </w:p>
         </w:tc>
@@ -206,9 +256,19 @@
             <w:tcW w:w="2817" w:type="dxa"/>
           </w:tcPr>
           <w:p>
-            <w:r>
-              <w:t>{ "email": "user@example.com", "password": "SecretPassword123" }</w:t>
-            </w:r>
+            <w:proofErr w:type="gramStart"/>
+            <w:r>
+              <w:t>{ "</w:t>
+            </w:r>
+            <w:proofErr w:type="gramEnd"/>
+            <w:r>
+              <w:t>email": "user@example.com", "password": "SecretPassword123</w:t>
+            </w:r>
+            <w:proofErr w:type="gramStart"/>
+            <w:r>
+              <w:t>" }</w:t>
+            </w:r>
+            <w:proofErr w:type="gramEnd"/>
           </w:p>
         </w:tc>
         <w:tc>
@@ -330,7 +390,15 @@
           </w:tcPr>
           <w:p>
             <w:r>
-              <w:t>/api/profile/me</w:t>
+              <w:t>/</w:t>
+            </w:r>
+            <w:proofErr w:type="spellStart"/>
+            <w:r>
+              <w:t>api</w:t>
+            </w:r>
+            <w:proofErr w:type="spellEnd"/>
+            <w:r>
+              <w:t>/profile/me</w:t>
             </w:r>
           </w:p>
         </w:tc>
@@ -392,7 +460,15 @@
           </w:tcPr>
           <w:p>
             <w:r>
-              <w:t>/api/profile/me</w:t>
+              <w:t>/</w:t>
+            </w:r>
+            <w:proofErr w:type="spellStart"/>
+            <w:r>
+              <w:t>api</w:t>
+            </w:r>
+            <w:proofErr w:type="spellEnd"/>
+            <w:r>
+              <w:t>/profile/me</w:t>
             </w:r>
           </w:p>
         </w:tc>
@@ -421,9 +497,32 @@
             <w:tcW w:w="2835" w:type="dxa"/>
           </w:tcPr>
           <w:p>
-            <w:r>
-              <w:t>{ "firstName": "John", "lastName": "Smith", "email": "john.smith@example.com" }</w:t>
-            </w:r>
+            <w:proofErr w:type="gramStart"/>
+            <w:r>
+              <w:t>{ "</w:t>
+            </w:r>
+            <w:proofErr w:type="spellStart"/>
+            <w:proofErr w:type="gramEnd"/>
+            <w:r>
+              <w:t>firstName</w:t>
+            </w:r>
+            <w:proofErr w:type="spellEnd"/>
+            <w:r>
+              <w:t>": "John", "</w:t>
+            </w:r>
+            <w:proofErr w:type="spellStart"/>
+            <w:r>
+              <w:t>lastName</w:t>
+            </w:r>
+            <w:proofErr w:type="spellEnd"/>
+            <w:r>
+              <w:t>": "Smith", "email": "john.smith@example.com</w:t>
+            </w:r>
+            <w:proofErr w:type="gramStart"/>
+            <w:r>
+              <w:t>" }</w:t>
+            </w:r>
+            <w:proofErr w:type="gramEnd"/>
           </w:p>
         </w:tc>
         <w:tc>
@@ -546,7 +645,15 @@
           </w:tcPr>
           <w:p>
             <w:r>
-              <w:t>/api/events</w:t>
+              <w:t>/</w:t>
+            </w:r>
+            <w:proofErr w:type="spellStart"/>
+            <w:r>
+              <w:t>api</w:t>
+            </w:r>
+            <w:proofErr w:type="spellEnd"/>
+            <w:r>
+              <w:t>/events</w:t>
             </w:r>
           </w:p>
         </w:tc>
@@ -609,7 +716,17 @@
           </w:tcPr>
           <w:p>
             <w:r>
-              <w:t>/api/events/{id}</w:t>
+              <w:t>/</w:t>
+            </w:r>
+            <w:proofErr w:type="spellStart"/>
+            <w:proofErr w:type="gramStart"/>
+            <w:r>
+              <w:t>api</w:t>
+            </w:r>
+            <w:proofErr w:type="spellEnd"/>
+            <w:proofErr w:type="gramEnd"/>
+            <w:r>
+              <w:t>/events/{id}</w:t>
             </w:r>
           </w:p>
           <w:p/>
@@ -677,7 +794,15 @@
           </w:tcPr>
           <w:p>
             <w:r>
-              <w:t>/api/events</w:t>
+              <w:t>/</w:t>
+            </w:r>
+            <w:proofErr w:type="spellStart"/>
+            <w:r>
+              <w:t>api</w:t>
+            </w:r>
+            <w:proofErr w:type="spellEnd"/>
+            <w:r>
+              <w:t>/events</w:t>
             </w:r>
           </w:p>
         </w:tc>
@@ -687,7 +812,15 @@
           </w:tcPr>
           <w:p>
             <w:r>
-              <w:t>Creates a new RaceDay event.</w:t>
+              <w:t xml:space="preserve">Creates a new </w:t>
+            </w:r>
+            <w:proofErr w:type="spellStart"/>
+            <w:r>
+              <w:t>RaceDay</w:t>
+            </w:r>
+            <w:proofErr w:type="spellEnd"/>
+            <w:r>
+              <w:t xml:space="preserve"> event.</w:t>
             </w:r>
           </w:p>
         </w:tc>
@@ -706,9 +839,32 @@
             <w:tcW w:w="2833" w:type="dxa"/>
           </w:tcPr>
           <w:p>
-            <w:r>
-              <w:t>{ "eventName": "Soweto Marathon", "title": "Annual Marathon", "description": "42km township run", "eventDate": "2026-11-01T06:00:00Z" }</w:t>
-            </w:r>
+            <w:proofErr w:type="gramStart"/>
+            <w:r>
+              <w:t>{ "</w:t>
+            </w:r>
+            <w:proofErr w:type="spellStart"/>
+            <w:proofErr w:type="gramEnd"/>
+            <w:r>
+              <w:t>eventName</w:t>
+            </w:r>
+            <w:proofErr w:type="spellEnd"/>
+            <w:r>
+              <w:t>": "Soweto Marathon", "title": "Annual Marathon", "description": "42km township run", "</w:t>
+            </w:r>
+            <w:proofErr w:type="spellStart"/>
+            <w:r>
+              <w:t>eventDate</w:t>
+            </w:r>
+            <w:proofErr w:type="spellEnd"/>
+            <w:r>
+              <w:t>": "2026-11-01T06:00:00Z</w:t>
+            </w:r>
+            <w:proofErr w:type="gramStart"/>
+            <w:r>
+              <w:t>" }</w:t>
+            </w:r>
+            <w:proofErr w:type="gramEnd"/>
           </w:p>
         </w:tc>
         <w:tc>
@@ -739,7 +895,17 @@
           </w:tcPr>
           <w:p>
             <w:r>
-              <w:t>/api/events/{id}</w:t>
+              <w:t>/</w:t>
+            </w:r>
+            <w:proofErr w:type="spellStart"/>
+            <w:proofErr w:type="gramStart"/>
+            <w:r>
+              <w:t>api</w:t>
+            </w:r>
+            <w:proofErr w:type="spellEnd"/>
+            <w:proofErr w:type="gramEnd"/>
+            <w:r>
+              <w:t>/events/{id}</w:t>
             </w:r>
           </w:p>
         </w:tc>
@@ -768,9 +934,32 @@
             <w:tcW w:w="2833" w:type="dxa"/>
           </w:tcPr>
           <w:p>
-            <w:r>
-              <w:t>{ "eventName": "Soweto Marathon 2026", "title": "Updated Title", "description": "Updated route", "eventDate": "2026-11-01T06:00:00Z" }</w:t>
-            </w:r>
+            <w:proofErr w:type="gramStart"/>
+            <w:r>
+              <w:t>{ "</w:t>
+            </w:r>
+            <w:proofErr w:type="spellStart"/>
+            <w:proofErr w:type="gramEnd"/>
+            <w:r>
+              <w:t>eventName</w:t>
+            </w:r>
+            <w:proofErr w:type="spellEnd"/>
+            <w:r>
+              <w:t>": "Soweto Marathon 2026", "title": "Updated Title", "description": "Updated route", "</w:t>
+            </w:r>
+            <w:proofErr w:type="spellStart"/>
+            <w:r>
+              <w:t>eventDate</w:t>
+            </w:r>
+            <w:proofErr w:type="spellEnd"/>
+            <w:r>
+              <w:t>": "2026-11-01T06:00:00Z</w:t>
+            </w:r>
+            <w:proofErr w:type="gramStart"/>
+            <w:r>
+              <w:t>" }</w:t>
+            </w:r>
+            <w:proofErr w:type="gramEnd"/>
           </w:p>
         </w:tc>
         <w:tc>
@@ -802,7 +991,17 @@
           </w:tcPr>
           <w:p>
             <w:r>
-              <w:t>/api/events/{id}</w:t>
+              <w:t>/</w:t>
+            </w:r>
+            <w:proofErr w:type="spellStart"/>
+            <w:proofErr w:type="gramStart"/>
+            <w:r>
+              <w:t>api</w:t>
+            </w:r>
+            <w:proofErr w:type="spellEnd"/>
+            <w:proofErr w:type="gramEnd"/>
+            <w:r>
+              <w:t>/events/{id}</w:t>
             </w:r>
           </w:p>
         </w:tc>
@@ -846,6 +1045,371 @@
           <w:p>
             <w:r>
               <w:t>204 No Content; 401 Unauthorized; 403 Forbidden; 404 Not Found</w:t>
+            </w:r>
+          </w:p>
+        </w:tc>
+      </w:tr>
+    </w:tbl>
+    <w:p/>
+    <w:tbl>
+      <w:tblPr>
+        <w:tblStyle w:val="TableGrid"/>
+        <w:tblW w:w="0" w:type="auto"/>
+        <w:tblLook w:val="04A0" w:firstRow="1" w:lastRow="0" w:firstColumn="1" w:lastColumn="0" w:noHBand="0" w:noVBand="1"/>
+      </w:tblPr>
+      <w:tblGrid>
+        <w:gridCol w:w="1408"/>
+        <w:gridCol w:w="3487"/>
+        <w:gridCol w:w="2319"/>
+        <w:gridCol w:w="2023"/>
+        <w:gridCol w:w="2370"/>
+        <w:gridCol w:w="2341"/>
+      </w:tblGrid>
+      <w:tr>
+        <w:tc>
+          <w:tcPr>
+            <w:tcW w:w="1696" w:type="dxa"/>
+          </w:tcPr>
+          <w:p>
+            <w:r>
+              <w:t>HTTP METHOD</w:t>
+            </w:r>
+          </w:p>
+        </w:tc>
+        <w:tc>
+          <w:tcPr>
+            <w:tcW w:w="1747" w:type="dxa"/>
+          </w:tcPr>
+          <w:p>
+            <w:r>
+              <w:t>ROUTE</w:t>
+            </w:r>
+          </w:p>
+        </w:tc>
+        <w:tc>
+          <w:tcPr>
+            <w:tcW w:w="1701" w:type="dxa"/>
+          </w:tcPr>
+          <w:p>
+            <w:r>
+              <w:t>DESCRPTION</w:t>
+            </w:r>
+          </w:p>
+        </w:tc>
+        <w:tc>
+          <w:tcPr>
+            <w:tcW w:w="2835" w:type="dxa"/>
+          </w:tcPr>
+          <w:p>
+            <w:r>
+              <w:t>ROLE REQUIRED</w:t>
+            </w:r>
+          </w:p>
+        </w:tc>
+        <w:tc>
+          <w:tcPr>
+            <w:tcW w:w="2835" w:type="dxa"/>
+          </w:tcPr>
+          <w:p>
+            <w:r>
+              <w:t>REQUEST BODY</w:t>
+            </w:r>
+          </w:p>
+        </w:tc>
+        <w:tc>
+          <w:tcPr>
+            <w:tcW w:w="3119" w:type="dxa"/>
+          </w:tcPr>
+          <w:p>
+            <w:r>
+              <w:t>EXPECTED RESPONSE</w:t>
+            </w:r>
+          </w:p>
+        </w:tc>
+      </w:tr>
+      <w:tr>
+        <w:tc>
+          <w:tcPr>
+            <w:tcW w:w="13933" w:type="dxa"/>
+            <w:gridSpan w:val="6"/>
+          </w:tcPr>
+          <w:p>
+            <w:r>
+              <w:t>Categories</w:t>
+            </w:r>
+          </w:p>
+        </w:tc>
+      </w:tr>
+      <w:tr>
+        <w:tc>
+          <w:tcPr>
+            <w:tcW w:w="1696" w:type="dxa"/>
+          </w:tcPr>
+          <w:p>
+            <w:r>
+              <w:t>GET</w:t>
+            </w:r>
+          </w:p>
+        </w:tc>
+        <w:tc>
+          <w:tcPr>
+            <w:tcW w:w="1747" w:type="dxa"/>
+          </w:tcPr>
+          <w:p>
+            <w:r>
+              <w:t>/</w:t>
+            </w:r>
+            <w:proofErr w:type="spellStart"/>
+            <w:r>
+              <w:t>api</w:t>
+            </w:r>
+            <w:proofErr w:type="spellEnd"/>
+            <w:r>
+              <w:t>/categories</w:t>
+            </w:r>
+          </w:p>
+        </w:tc>
+        <w:tc>
+          <w:tcPr>
+            <w:tcW w:w="1701" w:type="dxa"/>
+          </w:tcPr>
+          <w:p>
+            <w:r>
+              <w:t>Retrieves standard category definitions.</w:t>
+            </w:r>
+          </w:p>
+        </w:tc>
+        <w:tc>
+          <w:tcPr>
+            <w:tcW w:w="2835" w:type="dxa"/>
+          </w:tcPr>
+          <w:p>
+            <w:r>
+              <w:t>Organiser</w:t>
+            </w:r>
+          </w:p>
+          <w:p/>
+        </w:tc>
+        <w:tc>
+          <w:tcPr>
+            <w:tcW w:w="2835" w:type="dxa"/>
+          </w:tcPr>
+          <w:p>
+            <w:r>
+              <w:t>None</w:t>
+            </w:r>
+          </w:p>
+        </w:tc>
+        <w:tc>
+          <w:tcPr>
+            <w:tcW w:w="3119" w:type="dxa"/>
+          </w:tcPr>
+          <w:p>
+            <w:r>
+              <w:t>200 OK (Array of Category objects)</w:t>
+            </w:r>
+          </w:p>
+        </w:tc>
+      </w:tr>
+      <w:tr>
+        <w:tc>
+          <w:tcPr>
+            <w:tcW w:w="1696" w:type="dxa"/>
+          </w:tcPr>
+          <w:p>
+            <w:r>
+              <w:t>POST</w:t>
+            </w:r>
+          </w:p>
+        </w:tc>
+        <w:tc>
+          <w:tcPr>
+            <w:tcW w:w="1747" w:type="dxa"/>
+          </w:tcPr>
+          <w:p>
+            <w:r>
+              <w:t>/</w:t>
+            </w:r>
+            <w:proofErr w:type="spellStart"/>
+            <w:r>
+              <w:t>api</w:t>
+            </w:r>
+            <w:proofErr w:type="spellEnd"/>
+            <w:r>
+              <w:t>/categories</w:t>
+            </w:r>
+          </w:p>
+        </w:tc>
+        <w:tc>
+          <w:tcPr>
+            <w:tcW w:w="1701" w:type="dxa"/>
+          </w:tcPr>
+          <w:p>
+            <w:r>
+              <w:t>Creates a new master category record.</w:t>
+            </w:r>
+          </w:p>
+        </w:tc>
+        <w:tc>
+          <w:tcPr>
+            <w:tcW w:w="2835" w:type="dxa"/>
+          </w:tcPr>
+          <w:p>
+            <w:r>
+              <w:t>Organiser</w:t>
+            </w:r>
+          </w:p>
+          <w:p/>
+        </w:tc>
+        <w:tc>
+          <w:tcPr>
+            <w:tcW w:w="2835" w:type="dxa"/>
+          </w:tcPr>
+          <w:p>
+            <w:proofErr w:type="gramStart"/>
+            <w:r>
+              <w:t>{ "</w:t>
+            </w:r>
+            <w:proofErr w:type="spellStart"/>
+            <w:proofErr w:type="gramEnd"/>
+            <w:r>
+              <w:t>categoryName</w:t>
+            </w:r>
+            <w:proofErr w:type="spellEnd"/>
+            <w:r>
+              <w:t>": "Half Marathon", "description": "21.1km distance race</w:t>
+            </w:r>
+            <w:proofErr w:type="gramStart"/>
+            <w:r>
+              <w:t>" }</w:t>
+            </w:r>
+            <w:proofErr w:type="gramEnd"/>
+          </w:p>
+        </w:tc>
+        <w:tc>
+          <w:tcPr>
+            <w:tcW w:w="3119" w:type="dxa"/>
+          </w:tcPr>
+          <w:p>
+            <w:r>
+              <w:t>201 Created; 400 Bad Request; 401 Unauthorized; 403 Forbidden</w:t>
+            </w:r>
+          </w:p>
+        </w:tc>
+      </w:tr>
+      <w:tr>
+        <w:tc>
+          <w:tcPr>
+            <w:tcW w:w="1696" w:type="dxa"/>
+          </w:tcPr>
+          <w:p>
+            <w:r>
+              <w:t>POST</w:t>
+            </w:r>
+          </w:p>
+        </w:tc>
+        <w:tc>
+          <w:tcPr>
+            <w:tcW w:w="1747" w:type="dxa"/>
+          </w:tcPr>
+          <w:p>
+            <w:r>
+              <w:t>/</w:t>
+            </w:r>
+            <w:proofErr w:type="spellStart"/>
+            <w:proofErr w:type="gramStart"/>
+            <w:r>
+              <w:t>api</w:t>
+            </w:r>
+            <w:proofErr w:type="spellEnd"/>
+            <w:proofErr w:type="gramEnd"/>
+            <w:r>
+              <w:t>/events/{</w:t>
+            </w:r>
+            <w:proofErr w:type="spellStart"/>
+            <w:r>
+              <w:t>eventId</w:t>
+            </w:r>
+            <w:proofErr w:type="spellEnd"/>
+            <w:r>
+              <w:t>}/categories</w:t>
+            </w:r>
+          </w:p>
+        </w:tc>
+        <w:tc>
+          <w:tcPr>
+            <w:tcW w:w="1701" w:type="dxa"/>
+          </w:tcPr>
+          <w:p>
+            <w:r>
+              <w:t>Links a category to an event (EVENT_CATEGORY) with distance, fee, and location.</w:t>
+            </w:r>
+          </w:p>
+        </w:tc>
+        <w:tc>
+          <w:tcPr>
+            <w:tcW w:w="2835" w:type="dxa"/>
+          </w:tcPr>
+          <w:p>
+            <w:r>
+              <w:t>Organiser</w:t>
+            </w:r>
+          </w:p>
+        </w:tc>
+        <w:tc>
+          <w:tcPr>
+            <w:tcW w:w="2835" w:type="dxa"/>
+          </w:tcPr>
+          <w:p>
+            <w:r>
+              <w:t>"</w:t>
+            </w:r>
+            <w:proofErr w:type="spellStart"/>
+            <w:r>
+              <w:t>categoryID</w:t>
+            </w:r>
+            <w:proofErr w:type="spellEnd"/>
+            <w:r>
+              <w:t>": 2, "</w:t>
+            </w:r>
+            <w:proofErr w:type="spellStart"/>
+            <w:r>
+              <w:t>startLoaction</w:t>
+            </w:r>
+            <w:proofErr w:type="spellEnd"/>
+            <w:r>
+              <w:t>": "</w:t>
+            </w:r>
+            <w:proofErr w:type="spellStart"/>
+            <w:r>
+              <w:t>Nasrec</w:t>
+            </w:r>
+            <w:proofErr w:type="spellEnd"/>
+            <w:r>
+              <w:t xml:space="preserve"> Expo Centre", "</w:t>
+            </w:r>
+            <w:proofErr w:type="spellStart"/>
+            <w:r>
+              <w:t>entryFee</w:t>
+            </w:r>
+            <w:proofErr w:type="spellEnd"/>
+            <w:r>
+              <w:t>": 250.00, "distance": "21km</w:t>
+            </w:r>
+            <w:proofErr w:type="gramStart"/>
+            <w:r>
+              <w:t>" }</w:t>
+            </w:r>
+            <w:proofErr w:type="gramEnd"/>
+          </w:p>
+        </w:tc>
+        <w:tc>
+          <w:tcPr>
+            <w:tcW w:w="3119" w:type="dxa"/>
+          </w:tcPr>
+          <w:p>
+            <w:r>
+              <w:t>201 Created; 400 Bad Request; 401 Unauthorized; 403 Forbidden; 404 Not Found</w:t>
             </w:r>
           </w:p>
         </w:tc>
@@ -936,7 +1500,10 @@
           </w:tcPr>
           <w:p>
             <w:r>
-              <w:t>Categories</w:t>
+              <w:t xml:space="preserve">Event </w:t>
+            </w:r>
+            <w:r>
+              <w:t>Enrolments</w:t>
             </w:r>
           </w:p>
         </w:tc>
@@ -1002,138 +1569,7 @@
           </w:tcPr>
           <w:p>
             <w:r>
-              <w:t>HTTP METHOD</w:t>
-            </w:r>
-          </w:p>
-        </w:tc>
-        <w:tc>
-          <w:tcPr>
-            <w:tcW w:w="1701" w:type="dxa"/>
-          </w:tcPr>
-          <w:p>
-            <w:r>
-              <w:t>ROUTE</w:t>
-            </w:r>
-          </w:p>
-        </w:tc>
-        <w:tc>
-          <w:tcPr>
-            <w:tcW w:w="1701" w:type="dxa"/>
-          </w:tcPr>
-          <w:p>
-            <w:r>
-              <w:t>DESCRPTION</w:t>
-            </w:r>
-          </w:p>
-        </w:tc>
-        <w:tc>
-          <w:tcPr>
-            <w:tcW w:w="2835" w:type="dxa"/>
-          </w:tcPr>
-          <w:p>
-            <w:r>
-              <w:t>ROLE REQUIRED</w:t>
-            </w:r>
-          </w:p>
-        </w:tc>
-        <w:tc>
-          <w:tcPr>
-            <w:tcW w:w="2835" w:type="dxa"/>
-          </w:tcPr>
-          <w:p>
-            <w:r>
-              <w:t>REQUEST BODY</w:t>
-            </w:r>
-          </w:p>
-        </w:tc>
-        <w:tc>
-          <w:tcPr>
-            <w:tcW w:w="3119" w:type="dxa"/>
-          </w:tcPr>
-          <w:p>
-            <w:r>
-              <w:t>EXPECTED RESPONSE</w:t>
-            </w:r>
-          </w:p>
-        </w:tc>
-      </w:tr>
-      <w:tr>
-        <w:tc>
-          <w:tcPr>
-            <w:tcW w:w="13887" w:type="dxa"/>
-            <w:gridSpan w:val="6"/>
-          </w:tcPr>
-          <w:p>
-            <w:r>
-              <w:t xml:space="preserve">Event </w:t>
-            </w:r>
-            <w:r>
-              <w:t>Enrolments</w:t>
-            </w:r>
-          </w:p>
-        </w:tc>
-      </w:tr>
-      <w:tr>
-        <w:tc>
-          <w:tcPr>
-            <w:tcW w:w="1696" w:type="dxa"/>
-          </w:tcPr>
-          <w:p/>
-        </w:tc>
-        <w:tc>
-          <w:tcPr>
-            <w:tcW w:w="1701" w:type="dxa"/>
-          </w:tcPr>
-          <w:p/>
-        </w:tc>
-        <w:tc>
-          <w:tcPr>
-            <w:tcW w:w="1701" w:type="dxa"/>
-          </w:tcPr>
-          <w:p/>
-        </w:tc>
-        <w:tc>
-          <w:tcPr>
-            <w:tcW w:w="2835" w:type="dxa"/>
-          </w:tcPr>
-          <w:p/>
-        </w:tc>
-        <w:tc>
-          <w:tcPr>
-            <w:tcW w:w="2835" w:type="dxa"/>
-          </w:tcPr>
-          <w:p/>
-        </w:tc>
-        <w:tc>
-          <w:tcPr>
-            <w:tcW w:w="3119" w:type="dxa"/>
-          </w:tcPr>
-          <w:p/>
-        </w:tc>
-      </w:tr>
-    </w:tbl>
-    <w:p/>
-    <w:tbl>
-      <w:tblPr>
-        <w:tblStyle w:val="TableGrid"/>
-        <w:tblW w:w="0" w:type="auto"/>
-        <w:tblLook w:val="04A0" w:firstRow="1" w:lastRow="0" w:firstColumn="1" w:lastColumn="0" w:noHBand="0" w:noVBand="1"/>
-      </w:tblPr>
-      <w:tblGrid>
-        <w:gridCol w:w="1696"/>
-        <w:gridCol w:w="1701"/>
-        <w:gridCol w:w="1701"/>
-        <w:gridCol w:w="2835"/>
-        <w:gridCol w:w="2835"/>
-        <w:gridCol w:w="3119"/>
-      </w:tblGrid>
-      <w:tr>
-        <w:tc>
-          <w:tcPr>
-            <w:tcW w:w="1696" w:type="dxa"/>
-          </w:tcPr>
-          <w:p>
-            <w:r>
+              <w:lastRenderedPageBreak/>
               <w:t>HTTP METHOD</w:t>
             </w:r>
           </w:p>

</xml_diff>

<commit_message>
Add enrolment endpoints to API plan
</commit_message>
<xml_diff>
--- a/docs/RaceDay_API_Endpoint_Plan.docx
+++ b/docs/RaceDay_API_Endpoint_Plan.docx
@@ -1423,17 +1423,17 @@
         <w:tblLook w:val="04A0" w:firstRow="1" w:lastRow="0" w:firstColumn="1" w:lastColumn="0" w:noHBand="0" w:noVBand="1"/>
       </w:tblPr>
       <w:tblGrid>
-        <w:gridCol w:w="1696"/>
-        <w:gridCol w:w="1701"/>
-        <w:gridCol w:w="1701"/>
-        <w:gridCol w:w="2835"/>
-        <w:gridCol w:w="2835"/>
-        <w:gridCol w:w="3119"/>
+        <w:gridCol w:w="1463"/>
+        <w:gridCol w:w="3596"/>
+        <w:gridCol w:w="1665"/>
+        <w:gridCol w:w="2182"/>
+        <w:gridCol w:w="2551"/>
+        <w:gridCol w:w="2491"/>
       </w:tblGrid>
       <w:tr>
         <w:tc>
           <w:tcPr>
-            <w:tcW w:w="1696" w:type="dxa"/>
+            <w:tcW w:w="1631" w:type="dxa"/>
           </w:tcPr>
           <w:p>
             <w:r>
@@ -1443,7 +1443,7 @@
         </w:tc>
         <w:tc>
           <w:tcPr>
-            <w:tcW w:w="1701" w:type="dxa"/>
+            <w:tcW w:w="2266" w:type="dxa"/>
           </w:tcPr>
           <w:p>
             <w:r>
@@ -1453,7 +1453,7 @@
         </w:tc>
         <w:tc>
           <w:tcPr>
-            <w:tcW w:w="1701" w:type="dxa"/>
+            <w:tcW w:w="1691" w:type="dxa"/>
           </w:tcPr>
           <w:p>
             <w:r>
@@ -1463,7 +1463,7 @@
         </w:tc>
         <w:tc>
           <w:tcPr>
-            <w:tcW w:w="2835" w:type="dxa"/>
+            <w:tcW w:w="2656" w:type="dxa"/>
           </w:tcPr>
           <w:p>
             <w:r>
@@ -1473,7 +1473,7 @@
         </w:tc>
         <w:tc>
           <w:tcPr>
-            <w:tcW w:w="2835" w:type="dxa"/>
+            <w:tcW w:w="2757" w:type="dxa"/>
           </w:tcPr>
           <w:p>
             <w:r>
@@ -1483,7 +1483,7 @@
         </w:tc>
         <w:tc>
           <w:tcPr>
-            <w:tcW w:w="3119" w:type="dxa"/>
+            <w:tcW w:w="2947" w:type="dxa"/>
           </w:tcPr>
           <w:p>
             <w:r>
@@ -1495,7 +1495,7 @@
       <w:tr>
         <w:tc>
           <w:tcPr>
-            <w:tcW w:w="13887" w:type="dxa"/>
+            <w:tcW w:w="13948" w:type="dxa"/>
             <w:gridSpan w:val="6"/>
           </w:tcPr>
           <w:p>
@@ -1511,39 +1511,259 @@
       <w:tr>
         <w:tc>
           <w:tcPr>
-            <w:tcW w:w="1696" w:type="dxa"/>
-          </w:tcPr>
-          <w:p/>
-        </w:tc>
-        <w:tc>
-          <w:tcPr>
-            <w:tcW w:w="1701" w:type="dxa"/>
-          </w:tcPr>
-          <w:p/>
-        </w:tc>
-        <w:tc>
-          <w:tcPr>
-            <w:tcW w:w="1701" w:type="dxa"/>
-          </w:tcPr>
-          <w:p/>
-        </w:tc>
-        <w:tc>
-          <w:tcPr>
-            <w:tcW w:w="2835" w:type="dxa"/>
-          </w:tcPr>
-          <w:p/>
-        </w:tc>
-        <w:tc>
-          <w:tcPr>
-            <w:tcW w:w="2835" w:type="dxa"/>
-          </w:tcPr>
-          <w:p/>
-        </w:tc>
-        <w:tc>
-          <w:tcPr>
-            <w:tcW w:w="3119" w:type="dxa"/>
-          </w:tcPr>
-          <w:p/>
+            <w:tcW w:w="1631" w:type="dxa"/>
+          </w:tcPr>
+          <w:p>
+            <w:r>
+              <w:t>POST</w:t>
+            </w:r>
+          </w:p>
+        </w:tc>
+        <w:tc>
+          <w:tcPr>
+            <w:tcW w:w="2266" w:type="dxa"/>
+          </w:tcPr>
+          <w:p>
+            <w:r>
+              <w:t>/</w:t>
+            </w:r>
+            <w:proofErr w:type="spellStart"/>
+            <w:r>
+              <w:t>api</w:t>
+            </w:r>
+            <w:proofErr w:type="spellEnd"/>
+            <w:r>
+              <w:t>/enrolments</w:t>
+            </w:r>
+          </w:p>
+        </w:tc>
+        <w:tc>
+          <w:tcPr>
+            <w:tcW w:w="1691" w:type="dxa"/>
+          </w:tcPr>
+          <w:p>
+            <w:proofErr w:type="spellStart"/>
+            <w:r>
+              <w:t>Enrolls</w:t>
+            </w:r>
+            <w:proofErr w:type="spellEnd"/>
+            <w:r>
+              <w:t xml:space="preserve"> a participant into a specific </w:t>
+            </w:r>
+            <w:r>
+              <w:lastRenderedPageBreak/>
+              <w:t>event category.</w:t>
+            </w:r>
+          </w:p>
+        </w:tc>
+        <w:tc>
+          <w:tcPr>
+            <w:tcW w:w="2656" w:type="dxa"/>
+          </w:tcPr>
+          <w:p>
+            <w:r>
+              <w:lastRenderedPageBreak/>
+              <w:t>Participant</w:t>
+            </w:r>
+          </w:p>
+        </w:tc>
+        <w:tc>
+          <w:tcPr>
+            <w:tcW w:w="2757" w:type="dxa"/>
+          </w:tcPr>
+          <w:p>
+            <w:proofErr w:type="gramStart"/>
+            <w:r>
+              <w:t>{ "</w:t>
+            </w:r>
+            <w:proofErr w:type="spellStart"/>
+            <w:proofErr w:type="gramEnd"/>
+            <w:r>
+              <w:t>eventCategoryID</w:t>
+            </w:r>
+            <w:proofErr w:type="spellEnd"/>
+            <w:r>
+              <w:t xml:space="preserve">": </w:t>
+            </w:r>
+            <w:proofErr w:type="gramStart"/>
+            <w:r>
+              <w:t>5 }</w:t>
+            </w:r>
+            <w:proofErr w:type="gramEnd"/>
+          </w:p>
+        </w:tc>
+        <w:tc>
+          <w:tcPr>
+            <w:tcW w:w="2947" w:type="dxa"/>
+          </w:tcPr>
+          <w:p>
+            <w:r>
+              <w:t xml:space="preserve">201 Created (Enrolment object + </w:t>
+            </w:r>
+            <w:proofErr w:type="spellStart"/>
+            <w:r>
+              <w:t>raceNumber</w:t>
+            </w:r>
+            <w:proofErr w:type="spellEnd"/>
+            <w:r>
+              <w:t xml:space="preserve">); 400 </w:t>
+            </w:r>
+            <w:r>
+              <w:lastRenderedPageBreak/>
+              <w:t>Bad Request; 401 Unauthorized; 409 Conflict</w:t>
+            </w:r>
+          </w:p>
+        </w:tc>
+      </w:tr>
+      <w:tr>
+        <w:tc>
+          <w:tcPr>
+            <w:tcW w:w="1631" w:type="dxa"/>
+          </w:tcPr>
+          <w:p>
+            <w:r>
+              <w:lastRenderedPageBreak/>
+              <w:t>GET</w:t>
+            </w:r>
+          </w:p>
+        </w:tc>
+        <w:tc>
+          <w:tcPr>
+            <w:tcW w:w="2266" w:type="dxa"/>
+          </w:tcPr>
+          <w:p>
+            <w:r>
+              <w:t>/</w:t>
+            </w:r>
+            <w:proofErr w:type="spellStart"/>
+            <w:r>
+              <w:t>api</w:t>
+            </w:r>
+            <w:proofErr w:type="spellEnd"/>
+            <w:r>
+              <w:t>/enrolments/me</w:t>
+            </w:r>
+          </w:p>
+        </w:tc>
+        <w:tc>
+          <w:tcPr>
+            <w:tcW w:w="1691" w:type="dxa"/>
+          </w:tcPr>
+          <w:p>
+            <w:r>
+              <w:t>Retrieves personal event enrolments for the logged-in participant.</w:t>
+            </w:r>
+          </w:p>
+        </w:tc>
+        <w:tc>
+          <w:tcPr>
+            <w:tcW w:w="2656" w:type="dxa"/>
+          </w:tcPr>
+          <w:p>
+            <w:r>
+              <w:t>Participant</w:t>
+            </w:r>
+          </w:p>
+        </w:tc>
+        <w:tc>
+          <w:tcPr>
+            <w:tcW w:w="2757" w:type="dxa"/>
+          </w:tcPr>
+          <w:p>
+            <w:r>
+              <w:t>None</w:t>
+            </w:r>
+          </w:p>
+        </w:tc>
+        <w:tc>
+          <w:tcPr>
+            <w:tcW w:w="2947" w:type="dxa"/>
+          </w:tcPr>
+          <w:p>
+            <w:r>
+              <w:t>200 OK (Array of user Enrolment objects); 401 Unauthorized</w:t>
+            </w:r>
+          </w:p>
+        </w:tc>
+      </w:tr>
+      <w:tr>
+        <w:tc>
+          <w:tcPr>
+            <w:tcW w:w="1631" w:type="dxa"/>
+          </w:tcPr>
+          <w:p>
+            <w:r>
+              <w:t>GET</w:t>
+            </w:r>
+          </w:p>
+        </w:tc>
+        <w:tc>
+          <w:tcPr>
+            <w:tcW w:w="2266" w:type="dxa"/>
+          </w:tcPr>
+          <w:p>
+            <w:r>
+              <w:t>/</w:t>
+            </w:r>
+            <w:proofErr w:type="spellStart"/>
+            <w:proofErr w:type="gramStart"/>
+            <w:r>
+              <w:t>api</w:t>
+            </w:r>
+            <w:proofErr w:type="spellEnd"/>
+            <w:proofErr w:type="gramEnd"/>
+            <w:r>
+              <w:t>/events/{</w:t>
+            </w:r>
+            <w:proofErr w:type="spellStart"/>
+            <w:r>
+              <w:t>eventId</w:t>
+            </w:r>
+            <w:proofErr w:type="spellEnd"/>
+            <w:r>
+              <w:t>}/enrolments</w:t>
+            </w:r>
+          </w:p>
+        </w:tc>
+        <w:tc>
+          <w:tcPr>
+            <w:tcW w:w="1691" w:type="dxa"/>
+          </w:tcPr>
+          <w:p>
+            <w:r>
+              <w:t>Allows organisers to view all participant enrolments for an event they manage.</w:t>
+            </w:r>
+          </w:p>
+        </w:tc>
+        <w:tc>
+          <w:tcPr>
+            <w:tcW w:w="2656" w:type="dxa"/>
+          </w:tcPr>
+          <w:p>
+            <w:r>
+              <w:t>Organiser</w:t>
+            </w:r>
+          </w:p>
+        </w:tc>
+        <w:tc>
+          <w:tcPr>
+            <w:tcW w:w="2757" w:type="dxa"/>
+          </w:tcPr>
+          <w:p>
+            <w:r>
+              <w:t>None</w:t>
+            </w:r>
+          </w:p>
+        </w:tc>
+        <w:tc>
+          <w:tcPr>
+            <w:tcW w:w="2947" w:type="dxa"/>
+          </w:tcPr>
+          <w:p>
+            <w:r>
+              <w:t>200 OK (Array of Enrolment objects); 401 Unauthorized; 403 Forbidden</w:t>
+            </w:r>
+          </w:p>
         </w:tc>
       </w:tr>
     </w:tbl>
@@ -1569,7 +1789,6 @@
           </w:tcPr>
           <w:p>
             <w:r>
-              <w:lastRenderedPageBreak/>
               <w:t>HTTP METHOD</w:t>
             </w:r>
           </w:p>

</xml_diff>

<commit_message>
Add results endpoints to API plan
</commit_message>
<xml_diff>
--- a/docs/RaceDay_API_Endpoint_Plan.docx
+++ b/docs/RaceDay_API_Endpoint_Plan.docx
@@ -109,15 +109,7 @@
           </w:tcPr>
           <w:p>
             <w:r>
-              <w:t>/</w:t>
-            </w:r>
-            <w:proofErr w:type="spellStart"/>
-            <w:r>
-              <w:t>api</w:t>
-            </w:r>
-            <w:proofErr w:type="spellEnd"/>
-            <w:r>
-              <w:t>/auth/register</w:t>
+              <w:t>/api/auth/register</w:t>
             </w:r>
           </w:p>
         </w:tc>
@@ -152,43 +144,9 @@
             <w:tcW w:w="2817" w:type="dxa"/>
           </w:tcPr>
           <w:p>
-            <w:proofErr w:type="gramStart"/>
-            <w:r>
-              <w:t>{ "</w:t>
-            </w:r>
-            <w:proofErr w:type="gramEnd"/>
-            <w:r>
-              <w:t>email": "user@example.com", "password": "SecretPassword123", "</w:t>
-            </w:r>
-            <w:proofErr w:type="spellStart"/>
-            <w:r>
-              <w:t>firstName</w:t>
-            </w:r>
-            <w:proofErr w:type="spellEnd"/>
-            <w:r>
-              <w:t>": "John", "</w:t>
-            </w:r>
-            <w:proofErr w:type="spellStart"/>
-            <w:r>
-              <w:t>lastName</w:t>
-            </w:r>
-            <w:proofErr w:type="spellEnd"/>
-            <w:r>
-              <w:t>": "Doe", "</w:t>
-            </w:r>
-            <w:proofErr w:type="spellStart"/>
-            <w:r>
-              <w:t>roleID</w:t>
-            </w:r>
-            <w:proofErr w:type="spellEnd"/>
-            <w:r>
-              <w:t xml:space="preserve">": </w:t>
-            </w:r>
-            <w:proofErr w:type="gramStart"/>
-            <w:r>
-              <w:t>1 }</w:t>
-            </w:r>
-            <w:proofErr w:type="gramEnd"/>
+            <w:r>
+              <w:t>{ "email": "user@example.com", "password": "SecretPassword123", "firstName": "John", "lastName": "Doe", "roleID": 1 }</w:t>
+            </w:r>
           </w:p>
         </w:tc>
         <w:tc>
@@ -219,15 +177,7 @@
           </w:tcPr>
           <w:p>
             <w:r>
-              <w:t>/</w:t>
-            </w:r>
-            <w:proofErr w:type="spellStart"/>
-            <w:r>
-              <w:t>api</w:t>
-            </w:r>
-            <w:proofErr w:type="spellEnd"/>
-            <w:r>
-              <w:t>/auth/login</w:t>
+              <w:t>/api/auth/login</w:t>
             </w:r>
           </w:p>
         </w:tc>
@@ -256,19 +206,9 @@
             <w:tcW w:w="2817" w:type="dxa"/>
           </w:tcPr>
           <w:p>
-            <w:proofErr w:type="gramStart"/>
-            <w:r>
-              <w:t>{ "</w:t>
-            </w:r>
-            <w:proofErr w:type="gramEnd"/>
-            <w:r>
-              <w:t>email": "user@example.com", "password": "SecretPassword123</w:t>
-            </w:r>
-            <w:proofErr w:type="gramStart"/>
-            <w:r>
-              <w:t>" }</w:t>
-            </w:r>
-            <w:proofErr w:type="gramEnd"/>
+            <w:r>
+              <w:t>{ "email": "user@example.com", "password": "SecretPassword123" }</w:t>
+            </w:r>
           </w:p>
         </w:tc>
         <w:tc>
@@ -390,15 +330,7 @@
           </w:tcPr>
           <w:p>
             <w:r>
-              <w:t>/</w:t>
-            </w:r>
-            <w:proofErr w:type="spellStart"/>
-            <w:r>
-              <w:t>api</w:t>
-            </w:r>
-            <w:proofErr w:type="spellEnd"/>
-            <w:r>
-              <w:t>/profile/me</w:t>
+              <w:t>/api/profile/me</w:t>
             </w:r>
           </w:p>
         </w:tc>
@@ -460,15 +392,7 @@
           </w:tcPr>
           <w:p>
             <w:r>
-              <w:t>/</w:t>
-            </w:r>
-            <w:proofErr w:type="spellStart"/>
-            <w:r>
-              <w:t>api</w:t>
-            </w:r>
-            <w:proofErr w:type="spellEnd"/>
-            <w:r>
-              <w:t>/profile/me</w:t>
+              <w:t>/api/profile/me</w:t>
             </w:r>
           </w:p>
         </w:tc>
@@ -497,32 +421,9 @@
             <w:tcW w:w="2835" w:type="dxa"/>
           </w:tcPr>
           <w:p>
-            <w:proofErr w:type="gramStart"/>
-            <w:r>
-              <w:t>{ "</w:t>
-            </w:r>
-            <w:proofErr w:type="spellStart"/>
-            <w:proofErr w:type="gramEnd"/>
-            <w:r>
-              <w:t>firstName</w:t>
-            </w:r>
-            <w:proofErr w:type="spellEnd"/>
-            <w:r>
-              <w:t>": "John", "</w:t>
-            </w:r>
-            <w:proofErr w:type="spellStart"/>
-            <w:r>
-              <w:t>lastName</w:t>
-            </w:r>
-            <w:proofErr w:type="spellEnd"/>
-            <w:r>
-              <w:t>": "Smith", "email": "john.smith@example.com</w:t>
-            </w:r>
-            <w:proofErr w:type="gramStart"/>
-            <w:r>
-              <w:t>" }</w:t>
-            </w:r>
-            <w:proofErr w:type="gramEnd"/>
+            <w:r>
+              <w:t>{ "firstName": "John", "lastName": "Smith", "email": "john.smith@example.com" }</w:t>
+            </w:r>
           </w:p>
         </w:tc>
         <w:tc>
@@ -645,15 +546,7 @@
           </w:tcPr>
           <w:p>
             <w:r>
-              <w:t>/</w:t>
-            </w:r>
-            <w:proofErr w:type="spellStart"/>
-            <w:r>
-              <w:t>api</w:t>
-            </w:r>
-            <w:proofErr w:type="spellEnd"/>
-            <w:r>
-              <w:t>/events</w:t>
+              <w:t>/api/events</w:t>
             </w:r>
           </w:p>
         </w:tc>
@@ -716,17 +609,7 @@
           </w:tcPr>
           <w:p>
             <w:r>
-              <w:t>/</w:t>
-            </w:r>
-            <w:proofErr w:type="spellStart"/>
-            <w:proofErr w:type="gramStart"/>
-            <w:r>
-              <w:t>api</w:t>
-            </w:r>
-            <w:proofErr w:type="spellEnd"/>
-            <w:proofErr w:type="gramEnd"/>
-            <w:r>
-              <w:t>/events/{id}</w:t>
+              <w:t>/api/events/{id}</w:t>
             </w:r>
           </w:p>
           <w:p/>
@@ -794,15 +677,7 @@
           </w:tcPr>
           <w:p>
             <w:r>
-              <w:t>/</w:t>
-            </w:r>
-            <w:proofErr w:type="spellStart"/>
-            <w:r>
-              <w:t>api</w:t>
-            </w:r>
-            <w:proofErr w:type="spellEnd"/>
-            <w:r>
-              <w:t>/events</w:t>
+              <w:t>/api/events</w:t>
             </w:r>
           </w:p>
         </w:tc>
@@ -812,15 +687,7 @@
           </w:tcPr>
           <w:p>
             <w:r>
-              <w:t xml:space="preserve">Creates a new </w:t>
-            </w:r>
-            <w:proofErr w:type="spellStart"/>
-            <w:r>
-              <w:t>RaceDay</w:t>
-            </w:r>
-            <w:proofErr w:type="spellEnd"/>
-            <w:r>
-              <w:t xml:space="preserve"> event.</w:t>
+              <w:t>Creates a new RaceDay event.</w:t>
             </w:r>
           </w:p>
         </w:tc>
@@ -839,32 +706,9 @@
             <w:tcW w:w="2833" w:type="dxa"/>
           </w:tcPr>
           <w:p>
-            <w:proofErr w:type="gramStart"/>
-            <w:r>
-              <w:t>{ "</w:t>
-            </w:r>
-            <w:proofErr w:type="spellStart"/>
-            <w:proofErr w:type="gramEnd"/>
-            <w:r>
-              <w:t>eventName</w:t>
-            </w:r>
-            <w:proofErr w:type="spellEnd"/>
-            <w:r>
-              <w:t>": "Soweto Marathon", "title": "Annual Marathon", "description": "42km township run", "</w:t>
-            </w:r>
-            <w:proofErr w:type="spellStart"/>
-            <w:r>
-              <w:t>eventDate</w:t>
-            </w:r>
-            <w:proofErr w:type="spellEnd"/>
-            <w:r>
-              <w:t>": "2026-11-01T06:00:00Z</w:t>
-            </w:r>
-            <w:proofErr w:type="gramStart"/>
-            <w:r>
-              <w:t>" }</w:t>
-            </w:r>
-            <w:proofErr w:type="gramEnd"/>
+            <w:r>
+              <w:t>{ "eventName": "Soweto Marathon", "title": "Annual Marathon", "description": "42km township run", "eventDate": "2026-11-01T06:00:00Z" }</w:t>
+            </w:r>
           </w:p>
         </w:tc>
         <w:tc>
@@ -895,17 +739,7 @@
           </w:tcPr>
           <w:p>
             <w:r>
-              <w:t>/</w:t>
-            </w:r>
-            <w:proofErr w:type="spellStart"/>
-            <w:proofErr w:type="gramStart"/>
-            <w:r>
-              <w:t>api</w:t>
-            </w:r>
-            <w:proofErr w:type="spellEnd"/>
-            <w:proofErr w:type="gramEnd"/>
-            <w:r>
-              <w:t>/events/{id}</w:t>
+              <w:t>/api/events/{id}</w:t>
             </w:r>
           </w:p>
         </w:tc>
@@ -934,32 +768,9 @@
             <w:tcW w:w="2833" w:type="dxa"/>
           </w:tcPr>
           <w:p>
-            <w:proofErr w:type="gramStart"/>
-            <w:r>
-              <w:t>{ "</w:t>
-            </w:r>
-            <w:proofErr w:type="spellStart"/>
-            <w:proofErr w:type="gramEnd"/>
-            <w:r>
-              <w:t>eventName</w:t>
-            </w:r>
-            <w:proofErr w:type="spellEnd"/>
-            <w:r>
-              <w:t>": "Soweto Marathon 2026", "title": "Updated Title", "description": "Updated route", "</w:t>
-            </w:r>
-            <w:proofErr w:type="spellStart"/>
-            <w:r>
-              <w:t>eventDate</w:t>
-            </w:r>
-            <w:proofErr w:type="spellEnd"/>
-            <w:r>
-              <w:t>": "2026-11-01T06:00:00Z</w:t>
-            </w:r>
-            <w:proofErr w:type="gramStart"/>
-            <w:r>
-              <w:t>" }</w:t>
-            </w:r>
-            <w:proofErr w:type="gramEnd"/>
+            <w:r>
+              <w:t>{ "eventName": "Soweto Marathon 2026", "title": "Updated Title", "description": "Updated route", "eventDate": "2026-11-01T06:00:00Z" }</w:t>
+            </w:r>
           </w:p>
         </w:tc>
         <w:tc>
@@ -991,17 +802,7 @@
           </w:tcPr>
           <w:p>
             <w:r>
-              <w:t>/</w:t>
-            </w:r>
-            <w:proofErr w:type="spellStart"/>
-            <w:proofErr w:type="gramStart"/>
-            <w:r>
-              <w:t>api</w:t>
-            </w:r>
-            <w:proofErr w:type="spellEnd"/>
-            <w:proofErr w:type="gramEnd"/>
-            <w:r>
-              <w:t>/events/{id}</w:t>
+              <w:t>/api/events/{id}</w:t>
             </w:r>
           </w:p>
         </w:tc>
@@ -1157,15 +958,7 @@
           </w:tcPr>
           <w:p>
             <w:r>
-              <w:t>/</w:t>
-            </w:r>
-            <w:proofErr w:type="spellStart"/>
-            <w:r>
-              <w:t>api</w:t>
-            </w:r>
-            <w:proofErr w:type="spellEnd"/>
-            <w:r>
-              <w:t>/categories</w:t>
+              <w:t>/api/categories</w:t>
             </w:r>
           </w:p>
         </w:tc>
@@ -1228,15 +1021,7 @@
           </w:tcPr>
           <w:p>
             <w:r>
-              <w:t>/</w:t>
-            </w:r>
-            <w:proofErr w:type="spellStart"/>
-            <w:r>
-              <w:t>api</w:t>
-            </w:r>
-            <w:proofErr w:type="spellEnd"/>
-            <w:r>
-              <w:t>/categories</w:t>
+              <w:t>/api/categories</w:t>
             </w:r>
           </w:p>
         </w:tc>
@@ -1266,24 +1051,9 @@
             <w:tcW w:w="2835" w:type="dxa"/>
           </w:tcPr>
           <w:p>
-            <w:proofErr w:type="gramStart"/>
-            <w:r>
-              <w:t>{ "</w:t>
-            </w:r>
-            <w:proofErr w:type="spellStart"/>
-            <w:proofErr w:type="gramEnd"/>
-            <w:r>
-              <w:t>categoryName</w:t>
-            </w:r>
-            <w:proofErr w:type="spellEnd"/>
-            <w:r>
-              <w:t>": "Half Marathon", "description": "21.1km distance race</w:t>
-            </w:r>
-            <w:proofErr w:type="gramStart"/>
-            <w:r>
-              <w:t>" }</w:t>
-            </w:r>
-            <w:proofErr w:type="gramEnd"/>
+            <w:r>
+              <w:t>{ "categoryName": "Half Marathon", "description": "21.1km distance race" }</w:t>
+            </w:r>
           </w:p>
         </w:tc>
         <w:tc>
@@ -1314,25 +1084,7 @@
           </w:tcPr>
           <w:p>
             <w:r>
-              <w:t>/</w:t>
-            </w:r>
-            <w:proofErr w:type="spellStart"/>
-            <w:proofErr w:type="gramStart"/>
-            <w:r>
-              <w:t>api</w:t>
-            </w:r>
-            <w:proofErr w:type="spellEnd"/>
-            <w:proofErr w:type="gramEnd"/>
-            <w:r>
-              <w:t>/events/{</w:t>
-            </w:r>
-            <w:proofErr w:type="spellStart"/>
-            <w:r>
-              <w:t>eventId</w:t>
-            </w:r>
-            <w:proofErr w:type="spellEnd"/>
-            <w:r>
-              <w:t>}/categories</w:t>
+              <w:t>/api/events/{eventId}/categories</w:t>
             </w:r>
           </w:p>
         </w:tc>
@@ -1362,45 +1114,8 @@
           </w:tcPr>
           <w:p>
             <w:r>
-              <w:t>"</w:t>
-            </w:r>
-            <w:proofErr w:type="spellStart"/>
-            <w:r>
-              <w:t>categoryID</w:t>
-            </w:r>
-            <w:proofErr w:type="spellEnd"/>
-            <w:r>
-              <w:t>": 2, "</w:t>
-            </w:r>
-            <w:proofErr w:type="spellStart"/>
-            <w:r>
-              <w:t>startLoaction</w:t>
-            </w:r>
-            <w:proofErr w:type="spellEnd"/>
-            <w:r>
-              <w:t>": "</w:t>
-            </w:r>
-            <w:proofErr w:type="spellStart"/>
-            <w:r>
-              <w:t>Nasrec</w:t>
-            </w:r>
-            <w:proofErr w:type="spellEnd"/>
-            <w:r>
-              <w:t xml:space="preserve"> Expo Centre", "</w:t>
-            </w:r>
-            <w:proofErr w:type="spellStart"/>
-            <w:r>
-              <w:t>entryFee</w:t>
-            </w:r>
-            <w:proofErr w:type="spellEnd"/>
-            <w:r>
-              <w:t>": 250.00, "distance": "21km</w:t>
-            </w:r>
-            <w:proofErr w:type="gramStart"/>
-            <w:r>
-              <w:t>" }</w:t>
-            </w:r>
-            <w:proofErr w:type="gramEnd"/>
+              <w:t>"categoryID": 2, "startLoaction": "Nasrec Expo Centre", "entryFee": 250.00, "distance": "21km" }</w:t>
+            </w:r>
           </w:p>
         </w:tc>
         <w:tc>
@@ -1525,15 +1240,7 @@
           </w:tcPr>
           <w:p>
             <w:r>
-              <w:t>/</w:t>
-            </w:r>
-            <w:proofErr w:type="spellStart"/>
-            <w:r>
-              <w:t>api</w:t>
-            </w:r>
-            <w:proofErr w:type="spellEnd"/>
-            <w:r>
-              <w:t>/enrolments</w:t>
+              <w:t>/api/enrolments</w:t>
             </w:r>
           </w:p>
         </w:tc>
@@ -1542,13 +1249,8 @@
             <w:tcW w:w="1691" w:type="dxa"/>
           </w:tcPr>
           <w:p>
-            <w:proofErr w:type="spellStart"/>
-            <w:r>
-              <w:t>Enrolls</w:t>
-            </w:r>
-            <w:proofErr w:type="spellEnd"/>
-            <w:r>
-              <w:t xml:space="preserve"> a participant into a specific </w:t>
+            <w:r>
+              <w:t xml:space="preserve">Enrolls a participant into a specific </w:t>
             </w:r>
             <w:r>
               <w:lastRenderedPageBreak/>
@@ -1572,24 +1274,9 @@
             <w:tcW w:w="2757" w:type="dxa"/>
           </w:tcPr>
           <w:p>
-            <w:proofErr w:type="gramStart"/>
-            <w:r>
-              <w:t>{ "</w:t>
-            </w:r>
-            <w:proofErr w:type="spellStart"/>
-            <w:proofErr w:type="gramEnd"/>
-            <w:r>
-              <w:t>eventCategoryID</w:t>
-            </w:r>
-            <w:proofErr w:type="spellEnd"/>
-            <w:r>
-              <w:t xml:space="preserve">": </w:t>
-            </w:r>
-            <w:proofErr w:type="gramStart"/>
-            <w:r>
-              <w:t>5 }</w:t>
-            </w:r>
-            <w:proofErr w:type="gramEnd"/>
+            <w:r>
+              <w:t>{ "eventCategoryID": 5 }</w:t>
+            </w:r>
           </w:p>
         </w:tc>
         <w:tc>
@@ -1598,15 +1285,7 @@
           </w:tcPr>
           <w:p>
             <w:r>
-              <w:t xml:space="preserve">201 Created (Enrolment object + </w:t>
-            </w:r>
-            <w:proofErr w:type="spellStart"/>
-            <w:r>
-              <w:t>raceNumber</w:t>
-            </w:r>
-            <w:proofErr w:type="spellEnd"/>
-            <w:r>
-              <w:t xml:space="preserve">); 400 </w:t>
+              <w:t xml:space="preserve">201 Created (Enrolment object + raceNumber); 400 </w:t>
             </w:r>
             <w:r>
               <w:lastRenderedPageBreak/>
@@ -1633,15 +1312,7 @@
           </w:tcPr>
           <w:p>
             <w:r>
-              <w:t>/</w:t>
-            </w:r>
-            <w:proofErr w:type="spellStart"/>
-            <w:r>
-              <w:t>api</w:t>
-            </w:r>
-            <w:proofErr w:type="spellEnd"/>
-            <w:r>
-              <w:t>/enrolments/me</w:t>
+              <w:t>/api/enrolments/me</w:t>
             </w:r>
           </w:p>
         </w:tc>
@@ -1703,25 +1374,7 @@
           </w:tcPr>
           <w:p>
             <w:r>
-              <w:t>/</w:t>
-            </w:r>
-            <w:proofErr w:type="spellStart"/>
-            <w:proofErr w:type="gramStart"/>
-            <w:r>
-              <w:t>api</w:t>
-            </w:r>
-            <w:proofErr w:type="spellEnd"/>
-            <w:proofErr w:type="gramEnd"/>
-            <w:r>
-              <w:t>/events/{</w:t>
-            </w:r>
-            <w:proofErr w:type="spellStart"/>
-            <w:r>
-              <w:t>eventId</w:t>
-            </w:r>
-            <w:proofErr w:type="spellEnd"/>
-            <w:r>
-              <w:t>}/enrolments</w:t>
+              <w:t>/api/events/{eventId}/enrolments</w:t>
             </w:r>
           </w:p>
         </w:tc>
@@ -1775,17 +1428,17 @@
         <w:tblLook w:val="04A0" w:firstRow="1" w:lastRow="0" w:firstColumn="1" w:lastColumn="0" w:noHBand="0" w:noVBand="1"/>
       </w:tblPr>
       <w:tblGrid>
-        <w:gridCol w:w="1696"/>
-        <w:gridCol w:w="1701"/>
-        <w:gridCol w:w="1701"/>
-        <w:gridCol w:w="2835"/>
-        <w:gridCol w:w="2835"/>
-        <w:gridCol w:w="3119"/>
+        <w:gridCol w:w="1537"/>
+        <w:gridCol w:w="3127"/>
+        <w:gridCol w:w="1676"/>
+        <w:gridCol w:w="2389"/>
+        <w:gridCol w:w="2530"/>
+        <w:gridCol w:w="2689"/>
       </w:tblGrid>
       <w:tr>
         <w:tc>
           <w:tcPr>
-            <w:tcW w:w="1696" w:type="dxa"/>
+            <w:tcW w:w="1692" w:type="dxa"/>
           </w:tcPr>
           <w:p>
             <w:r>
@@ -1795,7 +1448,7 @@
         </w:tc>
         <w:tc>
           <w:tcPr>
-            <w:tcW w:w="1701" w:type="dxa"/>
+            <w:tcW w:w="1797" w:type="dxa"/>
           </w:tcPr>
           <w:p>
             <w:r>
@@ -1805,7 +1458,7 @@
         </w:tc>
         <w:tc>
           <w:tcPr>
-            <w:tcW w:w="1701" w:type="dxa"/>
+            <w:tcW w:w="1700" w:type="dxa"/>
           </w:tcPr>
           <w:p>
             <w:r>
@@ -1815,7 +1468,7 @@
         </w:tc>
         <w:tc>
           <w:tcPr>
-            <w:tcW w:w="2835" w:type="dxa"/>
+            <w:tcW w:w="2824" w:type="dxa"/>
           </w:tcPr>
           <w:p>
             <w:r>
@@ -1825,7 +1478,7 @@
         </w:tc>
         <w:tc>
           <w:tcPr>
-            <w:tcW w:w="2835" w:type="dxa"/>
+            <w:tcW w:w="2827" w:type="dxa"/>
           </w:tcPr>
           <w:p>
             <w:r>
@@ -1835,7 +1488,7 @@
         </w:tc>
         <w:tc>
           <w:tcPr>
-            <w:tcW w:w="3119" w:type="dxa"/>
+            <w:tcW w:w="3108" w:type="dxa"/>
           </w:tcPr>
           <w:p>
             <w:r>
@@ -1847,7 +1500,7 @@
       <w:tr>
         <w:tc>
           <w:tcPr>
-            <w:tcW w:w="13887" w:type="dxa"/>
+            <w:tcW w:w="13948" w:type="dxa"/>
             <w:gridSpan w:val="6"/>
           </w:tcPr>
           <w:p>
@@ -1860,39 +1513,202 @@
       <w:tr>
         <w:tc>
           <w:tcPr>
-            <w:tcW w:w="1696" w:type="dxa"/>
-          </w:tcPr>
-          <w:p/>
-        </w:tc>
-        <w:tc>
-          <w:tcPr>
-            <w:tcW w:w="1701" w:type="dxa"/>
-          </w:tcPr>
-          <w:p/>
-        </w:tc>
-        <w:tc>
-          <w:tcPr>
-            <w:tcW w:w="1701" w:type="dxa"/>
-          </w:tcPr>
-          <w:p/>
-        </w:tc>
-        <w:tc>
-          <w:tcPr>
-            <w:tcW w:w="2835" w:type="dxa"/>
-          </w:tcPr>
-          <w:p/>
-        </w:tc>
-        <w:tc>
-          <w:tcPr>
-            <w:tcW w:w="2835" w:type="dxa"/>
-          </w:tcPr>
-          <w:p/>
-        </w:tc>
-        <w:tc>
-          <w:tcPr>
-            <w:tcW w:w="3119" w:type="dxa"/>
-          </w:tcPr>
-          <w:p/>
+            <w:tcW w:w="1692" w:type="dxa"/>
+          </w:tcPr>
+          <w:p>
+            <w:r>
+              <w:t>POST</w:t>
+            </w:r>
+          </w:p>
+        </w:tc>
+        <w:tc>
+          <w:tcPr>
+            <w:tcW w:w="1797" w:type="dxa"/>
+          </w:tcPr>
+          <w:p>
+            <w:r>
+              <w:t>/api/results</w:t>
+            </w:r>
+          </w:p>
+        </w:tc>
+        <w:tc>
+          <w:tcPr>
+            <w:tcW w:w="1700" w:type="dxa"/>
+          </w:tcPr>
+          <w:p>
+            <w:r>
+              <w:t>Captures and records a participant's race result.</w:t>
+            </w:r>
+          </w:p>
+        </w:tc>
+        <w:tc>
+          <w:tcPr>
+            <w:tcW w:w="2824" w:type="dxa"/>
+          </w:tcPr>
+          <w:p>
+            <w:r>
+              <w:t>Organiser</w:t>
+            </w:r>
+          </w:p>
+        </w:tc>
+        <w:tc>
+          <w:tcPr>
+            <w:tcW w:w="2827" w:type="dxa"/>
+          </w:tcPr>
+          <w:p>
+            <w:r>
+              <w:t>{ "enrollmentID": 102, "finishTime": "01:45:12", "pace": "4:58 min/km", "position": 12, "status": "Finished" }</w:t>
+            </w:r>
+          </w:p>
+        </w:tc>
+        <w:tc>
+          <w:tcPr>
+            <w:tcW w:w="3108" w:type="dxa"/>
+          </w:tcPr>
+          <w:p>
+            <w:r>
+              <w:t>201 Created; 400 Bad Request; 401 Unauthorized; 403 Forbidden</w:t>
+            </w:r>
+          </w:p>
+        </w:tc>
+      </w:tr>
+      <w:tr>
+        <w:tc>
+          <w:tcPr>
+            <w:tcW w:w="1692" w:type="dxa"/>
+          </w:tcPr>
+          <w:p>
+            <w:r>
+              <w:t>GET</w:t>
+            </w:r>
+          </w:p>
+        </w:tc>
+        <w:tc>
+          <w:tcPr>
+            <w:tcW w:w="1797" w:type="dxa"/>
+          </w:tcPr>
+          <w:p>
+            <w:r>
+              <w:t>/api/results/me</w:t>
+            </w:r>
+          </w:p>
+        </w:tc>
+        <w:tc>
+          <w:tcPr>
+            <w:tcW w:w="1700" w:type="dxa"/>
+          </w:tcPr>
+          <w:p>
+            <w:r>
+              <w:t xml:space="preserve">Retrieves the logged-in </w:t>
+            </w:r>
+            <w:r>
+              <w:lastRenderedPageBreak/>
+              <w:t>participant's performance history across past events.</w:t>
+            </w:r>
+          </w:p>
+        </w:tc>
+        <w:tc>
+          <w:tcPr>
+            <w:tcW w:w="2824" w:type="dxa"/>
+          </w:tcPr>
+          <w:p>
+            <w:r>
+              <w:lastRenderedPageBreak/>
+              <w:t>Participant</w:t>
+            </w:r>
+          </w:p>
+        </w:tc>
+        <w:tc>
+          <w:tcPr>
+            <w:tcW w:w="2827" w:type="dxa"/>
+          </w:tcPr>
+          <w:p>
+            <w:r>
+              <w:t>None</w:t>
+            </w:r>
+          </w:p>
+        </w:tc>
+        <w:tc>
+          <w:tcPr>
+            <w:tcW w:w="3108" w:type="dxa"/>
+          </w:tcPr>
+          <w:p>
+            <w:r>
+              <w:t xml:space="preserve">200 OK (Array of personal Result </w:t>
+            </w:r>
+            <w:r>
+              <w:lastRenderedPageBreak/>
+              <w:t>objects); 401 Unauthorized</w:t>
+            </w:r>
+          </w:p>
+        </w:tc>
+      </w:tr>
+      <w:tr>
+        <w:tc>
+          <w:tcPr>
+            <w:tcW w:w="1692" w:type="dxa"/>
+          </w:tcPr>
+          <w:p>
+            <w:r>
+              <w:lastRenderedPageBreak/>
+              <w:t>GET</w:t>
+            </w:r>
+          </w:p>
+        </w:tc>
+        <w:tc>
+          <w:tcPr>
+            <w:tcW w:w="1797" w:type="dxa"/>
+          </w:tcPr>
+          <w:p>
+            <w:r>
+              <w:t>/api/events/{eventId}/results</w:t>
+            </w:r>
+          </w:p>
+        </w:tc>
+        <w:tc>
+          <w:tcPr>
+            <w:tcW w:w="1700" w:type="dxa"/>
+          </w:tcPr>
+          <w:p>
+            <w:r>
+              <w:t>Gets official race results and leaderboards for a specific event.</w:t>
+            </w:r>
+          </w:p>
+        </w:tc>
+        <w:tc>
+          <w:tcPr>
+            <w:tcW w:w="2824" w:type="dxa"/>
+          </w:tcPr>
+          <w:p>
+            <w:r>
+              <w:t>Public / Participant / Organiser</w:t>
+            </w:r>
+          </w:p>
+        </w:tc>
+        <w:tc>
+          <w:tcPr>
+            <w:tcW w:w="2827" w:type="dxa"/>
+          </w:tcPr>
+          <w:p>
+            <w:r>
+              <w:t>None</w:t>
+            </w:r>
+          </w:p>
+          <w:p>
+            <w:pPr>
+              <w:ind w:firstLine="720"/>
+            </w:pPr>
+          </w:p>
+        </w:tc>
+        <w:tc>
+          <w:tcPr>
+            <w:tcW w:w="3108" w:type="dxa"/>
+          </w:tcPr>
+          <w:p>
+            <w:r>
+              <w:t>200 OK (Array of official Result objects); 404 Not Found</w:t>
+            </w:r>
+          </w:p>
         </w:tc>
       </w:tr>
     </w:tbl>

</xml_diff>